<commit_message>
Two end point tables
two end point tables are now in the document, one table for the organiser and one table for the participant
</commit_message>
<xml_diff>
--- a/prog endpoint table.docx
+++ b/prog endpoint table.docx
@@ -178,13 +178,7 @@
               <w:cnfStyle w:val="000000100000" w:firstRow="0" w:lastRow="0" w:firstColumn="0" w:lastColumn="0" w:oddVBand="0" w:evenVBand="0" w:oddHBand="1" w:evenHBand="0" w:firstRowFirstColumn="0" w:firstRowLastColumn="0" w:lastRowFirstColumn="0" w:lastRowLastColumn="0"/>
             </w:pPr>
             <w:r>
-              <w:t>{“</w:t>
-            </w:r>
-            <w:r>
-              <w:t>email", "password</w:t>
-            </w:r>
-            <w:r>
-              <w:t>”}</w:t>
+              <w:t>{“email", "password”}</w:t>
             </w:r>
           </w:p>
         </w:tc>
@@ -684,13 +678,7 @@
                     <w:spacing w:after="0" w:line="240" w:lineRule="auto"/>
                   </w:pPr>
                   <w:r>
-                    <w:t>{“</w:t>
-                  </w:r>
-                  <w:r>
-                    <w:t>phoneNumber", "address</w:t>
-                  </w:r>
-                  <w:r>
-                    <w:t>”}</w:t>
+                    <w:t>{“phoneNumber", "address”}</w:t>
                   </w:r>
                 </w:p>
               </w:tc>
@@ -878,13 +866,7 @@
               <w:cnfStyle w:val="000000000000" w:firstRow="0" w:lastRow="0" w:firstColumn="0" w:lastColumn="0" w:oddVBand="0" w:evenVBand="0" w:oddHBand="0" w:evenHBand="0" w:firstRowFirstColumn="0" w:firstRowLastColumn="0" w:lastRowFirstColumn="0" w:lastRowLastColumn="0"/>
             </w:pPr>
             <w:r>
-              <w:t>{“</w:t>
-            </w:r>
-            <w:r>
-              <w:t>eventName", "description", "eventDate", "startTime", "location", "distance</w:t>
-            </w:r>
-            <w:r>
-              <w:t>”}</w:t>
+              <w:t>{“eventName", "description", "eventDate", "startTime", "location", "distance”}</w:t>
             </w:r>
           </w:p>
         </w:tc>
@@ -977,7 +959,15 @@
                     <w:spacing w:after="0" w:line="240" w:lineRule="auto"/>
                   </w:pPr>
                   <w:r>
-                    <w:t>/api/events/{id}</w:t>
+                    <w:t>/</w:t>
+                  </w:r>
+                  <w:proofErr w:type="gramStart"/>
+                  <w:r>
+                    <w:t>api</w:t>
+                  </w:r>
+                  <w:proofErr w:type="gramEnd"/>
+                  <w:r>
+                    <w:t>/events/{id}</w:t>
                   </w:r>
                 </w:p>
               </w:tc>
@@ -1143,8 +1133,13 @@
             <w:pPr>
               <w:cnfStyle w:val="000000100000" w:firstRow="0" w:lastRow="0" w:firstColumn="0" w:lastColumn="0" w:oddVBand="0" w:evenVBand="0" w:oddHBand="1" w:evenHBand="0" w:firstRowFirstColumn="0" w:firstRowLastColumn="0" w:lastRowFirstColumn="0" w:lastRowLastColumn="0"/>
             </w:pPr>
-            <w:r>
-              <w:t>{ "eventName", "description", "eventDate", "startTime", "location", "distance", "status"}</w:t>
+            <w:proofErr w:type="gramStart"/>
+            <w:r>
+              <w:t>{ "</w:t>
+            </w:r>
+            <w:proofErr w:type="gramEnd"/>
+            <w:r>
+              <w:t>eventName", "description", "eventDate", "startTime", "location", "distance", "status"}</w:t>
             </w:r>
           </w:p>
         </w:tc>
@@ -1268,13 +1263,7 @@
                     <w:spacing w:after="0" w:line="240" w:lineRule="auto"/>
                   </w:pPr>
                   <w:r>
-                    <w:t>/</w:t>
-                  </w:r>
-                  <w:r>
-                    <w:t>Api</w:t>
-                  </w:r>
-                  <w:r>
-                    <w:t>/events/{id}</w:t>
+                    <w:t>/Api/events/{id}</w:t>
                   </w:r>
                 </w:p>
               </w:tc>
@@ -1681,13 +1670,7 @@
               <w:cnfStyle w:val="000000100000" w:firstRow="0" w:lastRow="0" w:firstColumn="0" w:lastColumn="0" w:oddVBand="0" w:evenVBand="0" w:oddHBand="1" w:evenHBand="0" w:firstRowFirstColumn="0" w:firstRowLastColumn="0" w:lastRowFirstColumn="0" w:lastRowLastColumn="0"/>
             </w:pPr>
             <w:r>
-              <w:t>{“</w:t>
-            </w:r>
-            <w:r>
-              <w:t>categoryName", "description</w:t>
-            </w:r>
-            <w:r>
-              <w:t>”}</w:t>
+              <w:t>{“categoryName", "description”}</w:t>
             </w:r>
           </w:p>
         </w:tc>
@@ -1744,7 +1727,15 @@
               <w:cnfStyle w:val="000000000000" w:firstRow="0" w:lastRow="0" w:firstColumn="0" w:lastColumn="0" w:oddVBand="0" w:evenVBand="0" w:oddHBand="0" w:evenHBand="0" w:firstRowFirstColumn="0" w:firstRowLastColumn="0" w:lastRowFirstColumn="0" w:lastRowLastColumn="0"/>
             </w:pPr>
             <w:r>
-              <w:t>/api/categories/{id}</w:t>
+              <w:t>/</w:t>
+            </w:r>
+            <w:proofErr w:type="gramStart"/>
+            <w:r>
+              <w:t>api</w:t>
+            </w:r>
+            <w:proofErr w:type="gramEnd"/>
+            <w:r>
+              <w:t>/categories/{id}</w:t>
             </w:r>
           </w:p>
         </w:tc>
@@ -1999,7 +1990,15 @@
                     <w:spacing w:after="0" w:line="240" w:lineRule="auto"/>
                   </w:pPr>
                   <w:r>
-                    <w:t>/api/categories/{id}</w:t>
+                    <w:t>/</w:t>
+                  </w:r>
+                  <w:proofErr w:type="gramStart"/>
+                  <w:r>
+                    <w:t>api</w:t>
+                  </w:r>
+                  <w:proofErr w:type="gramEnd"/>
+                  <w:r>
+                    <w:t>/categories/{id}</w:t>
                   </w:r>
                 </w:p>
               </w:tc>
@@ -2177,7 +2176,15 @@
               <w:cnfStyle w:val="000000000000" w:firstRow="0" w:lastRow="0" w:firstColumn="0" w:lastColumn="0" w:oddVBand="0" w:evenVBand="0" w:oddHBand="0" w:evenHBand="0" w:firstRowFirstColumn="0" w:firstRowLastColumn="0" w:lastRowFirstColumn="0" w:lastRowLastColumn="0"/>
             </w:pPr>
             <w:r>
-              <w:t>/api/events/{eventId}/categories</w:t>
+              <w:t>/</w:t>
+            </w:r>
+            <w:proofErr w:type="gramStart"/>
+            <w:r>
+              <w:t>api</w:t>
+            </w:r>
+            <w:proofErr w:type="gramEnd"/>
+            <w:r>
+              <w:t>/events/{eventId}/categories</w:t>
             </w:r>
           </w:p>
         </w:tc>
@@ -2216,11 +2223,13 @@
               <w:cnfStyle w:val="000000000000" w:firstRow="0" w:lastRow="0" w:firstColumn="0" w:lastColumn="0" w:oddVBand="0" w:evenVBand="0" w:oddHBand="0" w:evenHBand="0" w:firstRowFirstColumn="0" w:firstRowLastColumn="0" w:lastRowFirstColumn="0" w:lastRowLastColumn="0"/>
             </w:pPr>
             <w:r>
-              <w:t>{“</w:t>
-            </w:r>
-            <w:r>
-              <w:t>categoryId", "entryFee", "maximumParticipants" }</w:t>
-            </w:r>
+              <w:t>{“categoryId", "entryFee", "maximumParticipants</w:t>
+            </w:r>
+            <w:proofErr w:type="gramStart"/>
+            <w:r>
+              <w:t>" }</w:t>
+            </w:r>
+            <w:proofErr w:type="gramEnd"/>
           </w:p>
         </w:tc>
         <w:tc>
@@ -2279,7 +2288,15 @@
               <w:cnfStyle w:val="000000100000" w:firstRow="0" w:lastRow="0" w:firstColumn="0" w:lastColumn="0" w:oddVBand="0" w:evenVBand="0" w:oddHBand="1" w:evenHBand="0" w:firstRowFirstColumn="0" w:firstRowLastColumn="0" w:lastRowFirstColumn="0" w:lastRowLastColumn="0"/>
             </w:pPr>
             <w:r>
-              <w:t>/api/events/{eventId}/categories</w:t>
+              <w:t>/</w:t>
+            </w:r>
+            <w:proofErr w:type="gramStart"/>
+            <w:r>
+              <w:t>api</w:t>
+            </w:r>
+            <w:proofErr w:type="gramEnd"/>
+            <w:r>
+              <w:t>/events/{eventId}/categories</w:t>
             </w:r>
           </w:p>
           <w:p>
@@ -2532,10 +2549,15 @@
                     <w:spacing w:after="0" w:line="240" w:lineRule="auto"/>
                   </w:pPr>
                   <w:r>
-                    <w:t>/api/events/{eventId}/</w:t>
+                    <w:t>/</w:t>
                   </w:r>
+                  <w:proofErr w:type="gramStart"/>
                   <w:r>
-                    <w:t>enrolments</w:t>
+                    <w:t>api</w:t>
+                  </w:r>
+                  <w:proofErr w:type="gramEnd"/>
+                  <w:r>
+                    <w:t>/events/{eventId}/enrolments</w:t>
                   </w:r>
                 </w:p>
               </w:tc>
@@ -2693,10 +2715,7 @@
               <w:cnfStyle w:val="000000100000" w:firstRow="0" w:lastRow="0" w:firstColumn="0" w:lastColumn="0" w:oddVBand="0" w:evenVBand="0" w:oddHBand="1" w:evenHBand="0" w:firstRowFirstColumn="0" w:firstRowLastColumn="0" w:lastRowFirstColumn="0" w:lastRowLastColumn="0"/>
             </w:pPr>
             <w:r>
-              <w:t>{“enrolment</w:t>
-            </w:r>
-            <w:r>
-              <w:t>", "finishTime", "position", "resultStatus</w:t>
+              <w:t>{“enrolment", "finishTime", "position", "resultStatus</w:t>
             </w:r>
             <w:r>
               <w:t>”}</w:t>
@@ -2729,13 +2748,7 @@
               <w:t>404 Not Found</w:t>
             </w:r>
             <w:r>
-              <w:t xml:space="preserve"> – </w:t>
-            </w:r>
-            <w:r>
-              <w:t>Enrolment</w:t>
-            </w:r>
-            <w:r>
-              <w:t xml:space="preserve"> does not exist.</w:t>
+              <w:t xml:space="preserve"> – Enrolment does not exist.</w:t>
             </w:r>
           </w:p>
         </w:tc>
@@ -2828,7 +2841,15 @@
                     <w:spacing w:after="0" w:line="240" w:lineRule="auto"/>
                   </w:pPr>
                   <w:r>
-                    <w:t>/api/results/{id}</w:t>
+                    <w:t>/</w:t>
+                  </w:r>
+                  <w:proofErr w:type="gramStart"/>
+                  <w:r>
+                    <w:t>api</w:t>
+                  </w:r>
+                  <w:proofErr w:type="gramEnd"/>
+                  <w:r>
+                    <w:t>/results/{id}</w:t>
                   </w:r>
                 </w:p>
               </w:tc>
@@ -2875,10 +2896,7 @@
               <w:cnfStyle w:val="000000000000" w:firstRow="0" w:lastRow="0" w:firstColumn="0" w:lastColumn="0" w:oddVBand="0" w:evenVBand="0" w:oddHBand="0" w:evenHBand="0" w:firstRowFirstColumn="0" w:firstRowLastColumn="0" w:lastRowFirstColumn="0" w:lastRowLastColumn="0"/>
             </w:pPr>
             <w:r>
-              <w:t>{“</w:t>
-            </w:r>
-            <w:r>
-              <w:t>finishTime", "position", "resultStatus"}</w:t>
+              <w:t>{“finishTime", "position", "resultStatus"}</w:t>
             </w:r>
           </w:p>
         </w:tc>
@@ -2963,7 +2981,15 @@
                     <w:spacing w:after="0" w:line="240" w:lineRule="auto"/>
                   </w:pPr>
                   <w:r>
-                    <w:t>/api/events/{eventId}/results</w:t>
+                    <w:t>/</w:t>
+                  </w:r>
+                  <w:proofErr w:type="gramStart"/>
+                  <w:r>
+                    <w:t>api</w:t>
+                  </w:r>
+                  <w:proofErr w:type="gramEnd"/>
+                  <w:r>
+                    <w:t>/events/{eventId}/results</w:t>
                   </w:r>
                 </w:p>
               </w:tc>
@@ -3161,9 +3187,2367 @@
         </w:tc>
       </w:tr>
     </w:tbl>
+    <w:tbl>
+      <w:tblPr>
+        <w:tblStyle w:val="GridTable5Dark-Accent5"/>
+        <w:tblpPr w:leftFromText="180" w:rightFromText="180" w:vertAnchor="page" w:horzAnchor="margin" w:tblpY="3097"/>
+        <w:tblW w:w="0" w:type="auto"/>
+        <w:tblLook w:val="04A0" w:firstRow="1" w:lastRow="0" w:firstColumn="1" w:lastColumn="0" w:noHBand="0" w:noVBand="1"/>
+      </w:tblPr>
+      <w:tblGrid>
+        <w:gridCol w:w="845"/>
+        <w:gridCol w:w="1869"/>
+        <w:gridCol w:w="1191"/>
+        <w:gridCol w:w="1169"/>
+        <w:gridCol w:w="2513"/>
+        <w:gridCol w:w="1429"/>
+      </w:tblGrid>
+      <w:tr>
+        <w:trPr>
+          <w:cnfStyle w:val="100000000000" w:firstRow="1" w:lastRow="0" w:firstColumn="0" w:lastColumn="0" w:oddVBand="0" w:evenVBand="0" w:oddHBand="0" w:evenHBand="0" w:firstRowFirstColumn="0" w:firstRowLastColumn="0" w:lastRowFirstColumn="0" w:lastRowLastColumn="0"/>
+        </w:trPr>
+        <w:tc>
+          <w:tcPr>
+            <w:cnfStyle w:val="001000000000" w:firstRow="0" w:lastRow="0" w:firstColumn="1" w:lastColumn="0" w:oddVBand="0" w:evenVBand="0" w:oddHBand="0" w:evenHBand="0" w:firstRowFirstColumn="0" w:firstRowLastColumn="0" w:lastRowFirstColumn="0" w:lastRowLastColumn="0"/>
+            <w:tcW w:w="1502" w:type="dxa"/>
+          </w:tcPr>
+          <w:p>
+            <w:r>
+              <w:rPr>
+                <w:b w:val="0"/>
+                <w:bCs w:val="0"/>
+              </w:rPr>
+              <w:lastRenderedPageBreak/>
+              <w:t>HTTP Method</w:t>
+            </w:r>
+          </w:p>
+        </w:tc>
+        <w:tc>
+          <w:tcPr>
+            <w:tcW w:w="1502" w:type="dxa"/>
+          </w:tcPr>
+          <w:p>
+            <w:pPr>
+              <w:cnfStyle w:val="100000000000" w:firstRow="1" w:lastRow="0" w:firstColumn="0" w:lastColumn="0" w:oddVBand="0" w:evenVBand="0" w:oddHBand="0" w:evenHBand="0" w:firstRowFirstColumn="0" w:firstRowLastColumn="0" w:lastRowFirstColumn="0" w:lastRowLastColumn="0"/>
+            </w:pPr>
+            <w:r>
+              <w:rPr>
+                <w:b w:val="0"/>
+                <w:bCs w:val="0"/>
+              </w:rPr>
+              <w:t>Route</w:t>
+            </w:r>
+          </w:p>
+        </w:tc>
+        <w:tc>
+          <w:tcPr>
+            <w:tcW w:w="1503" w:type="dxa"/>
+          </w:tcPr>
+          <w:p>
+            <w:pPr>
+              <w:cnfStyle w:val="100000000000" w:firstRow="1" w:lastRow="0" w:firstColumn="0" w:lastColumn="0" w:oddVBand="0" w:evenVBand="0" w:oddHBand="0" w:evenHBand="0" w:firstRowFirstColumn="0" w:firstRowLastColumn="0" w:lastRowFirstColumn="0" w:lastRowLastColumn="0"/>
+            </w:pPr>
+            <w:r>
+              <w:rPr>
+                <w:b w:val="0"/>
+                <w:bCs w:val="0"/>
+              </w:rPr>
+              <w:t>Description</w:t>
+            </w:r>
+          </w:p>
+        </w:tc>
+        <w:tc>
+          <w:tcPr>
+            <w:tcW w:w="1503" w:type="dxa"/>
+          </w:tcPr>
+          <w:p>
+            <w:pPr>
+              <w:cnfStyle w:val="100000000000" w:firstRow="1" w:lastRow="0" w:firstColumn="0" w:lastColumn="0" w:oddVBand="0" w:evenVBand="0" w:oddHBand="0" w:evenHBand="0" w:firstRowFirstColumn="0" w:firstRowLastColumn="0" w:lastRowFirstColumn="0" w:lastRowLastColumn="0"/>
+            </w:pPr>
+            <w:r>
+              <w:rPr>
+                <w:b w:val="0"/>
+                <w:bCs w:val="0"/>
+              </w:rPr>
+              <w:t>Role Required</w:t>
+            </w:r>
+          </w:p>
+        </w:tc>
+        <w:tc>
+          <w:tcPr>
+            <w:tcW w:w="1503" w:type="dxa"/>
+          </w:tcPr>
+          <w:p>
+            <w:pPr>
+              <w:cnfStyle w:val="100000000000" w:firstRow="1" w:lastRow="0" w:firstColumn="0" w:lastColumn="0" w:oddVBand="0" w:evenVBand="0" w:oddHBand="0" w:evenHBand="0" w:firstRowFirstColumn="0" w:firstRowLastColumn="0" w:lastRowFirstColumn="0" w:lastRowLastColumn="0"/>
+            </w:pPr>
+            <w:r>
+              <w:rPr>
+                <w:b w:val="0"/>
+                <w:bCs w:val="0"/>
+              </w:rPr>
+              <w:t>Request Body</w:t>
+            </w:r>
+          </w:p>
+        </w:tc>
+        <w:tc>
+          <w:tcPr>
+            <w:tcW w:w="1503" w:type="dxa"/>
+          </w:tcPr>
+          <w:p>
+            <w:pPr>
+              <w:cnfStyle w:val="100000000000" w:firstRow="1" w:lastRow="0" w:firstColumn="0" w:lastColumn="0" w:oddVBand="0" w:evenVBand="0" w:oddHBand="0" w:evenHBand="0" w:firstRowFirstColumn="0" w:firstRowLastColumn="0" w:lastRowFirstColumn="0" w:lastRowLastColumn="0"/>
+            </w:pPr>
+            <w:r>
+              <w:rPr>
+                <w:b w:val="0"/>
+                <w:bCs w:val="0"/>
+              </w:rPr>
+              <w:t>Expected Response</w:t>
+            </w:r>
+          </w:p>
+        </w:tc>
+      </w:tr>
+      <w:tr>
+        <w:trPr>
+          <w:cnfStyle w:val="000000100000" w:firstRow="0" w:lastRow="0" w:firstColumn="0" w:lastColumn="0" w:oddVBand="0" w:evenVBand="0" w:oddHBand="1" w:evenHBand="0" w:firstRowFirstColumn="0" w:firstRowLastColumn="0" w:lastRowFirstColumn="0" w:lastRowLastColumn="0"/>
+        </w:trPr>
+        <w:tc>
+          <w:tcPr>
+            <w:cnfStyle w:val="001000000000" w:firstRow="0" w:lastRow="0" w:firstColumn="1" w:lastColumn="0" w:oddVBand="0" w:evenVBand="0" w:oddHBand="0" w:evenHBand="0" w:firstRowFirstColumn="0" w:firstRowLastColumn="0" w:lastRowFirstColumn="0" w:lastRowLastColumn="0"/>
+            <w:tcW w:w="1502" w:type="dxa"/>
+          </w:tcPr>
+          <w:p>
+            <w:r>
+              <w:rPr>
+                <w:rStyle w:val="Strong"/>
+              </w:rPr>
+              <w:t>POST</w:t>
+            </w:r>
+          </w:p>
+        </w:tc>
+        <w:tc>
+          <w:tcPr>
+            <w:tcW w:w="1502" w:type="dxa"/>
+          </w:tcPr>
+          <w:p>
+            <w:pPr>
+              <w:cnfStyle w:val="000000100000" w:firstRow="0" w:lastRow="0" w:firstColumn="0" w:lastColumn="0" w:oddVBand="0" w:evenVBand="0" w:oddHBand="1" w:evenHBand="0" w:firstRowFirstColumn="0" w:firstRowLastColumn="0" w:lastRowFirstColumn="0" w:lastRowLastColumn="0"/>
+            </w:pPr>
+            <w:r>
+              <w:rPr>
+                <w:rStyle w:val="HTMLCode"/>
+                <w:rFonts w:asciiTheme="minorHAnsi" w:eastAsiaTheme="minorHAnsi" w:hAnsiTheme="minorHAnsi"/>
+                <w:sz w:val="24"/>
+                <w:szCs w:val="24"/>
+              </w:rPr>
+              <w:t>/</w:t>
+            </w:r>
+            <w:r>
+              <w:rPr>
+                <w:rStyle w:val="HTMLCode"/>
+                <w:rFonts w:ascii="Abadi" w:eastAsiaTheme="minorHAnsi" w:hAnsi="Abadi"/>
+                <w:sz w:val="24"/>
+                <w:szCs w:val="24"/>
+              </w:rPr>
+              <w:t>api/auth/register</w:t>
+            </w:r>
+          </w:p>
+        </w:tc>
+        <w:tc>
+          <w:tcPr>
+            <w:tcW w:w="1503" w:type="dxa"/>
+          </w:tcPr>
+          <w:p>
+            <w:pPr>
+              <w:cnfStyle w:val="000000100000" w:firstRow="0" w:lastRow="0" w:firstColumn="0" w:lastColumn="0" w:oddVBand="0" w:evenVBand="0" w:oddHBand="1" w:evenHBand="0" w:firstRowFirstColumn="0" w:firstRowLastColumn="0" w:lastRowFirstColumn="0" w:lastRowLastColumn="0"/>
+            </w:pPr>
+            <w:r>
+              <w:t>Creates a new Participant account.</w:t>
+            </w:r>
+          </w:p>
+        </w:tc>
+        <w:tc>
+          <w:tcPr>
+            <w:tcW w:w="1503" w:type="dxa"/>
+          </w:tcPr>
+          <w:p>
+            <w:pPr>
+              <w:cnfStyle w:val="000000100000" w:firstRow="0" w:lastRow="0" w:firstColumn="0" w:lastColumn="0" w:oddVBand="0" w:evenVBand="0" w:oddHBand="1" w:evenHBand="0" w:firstRowFirstColumn="0" w:firstRowLastColumn="0" w:lastRowFirstColumn="0" w:lastRowLastColumn="0"/>
+            </w:pPr>
+            <w:r>
+              <w:t>Public</w:t>
+            </w:r>
+          </w:p>
+        </w:tc>
+        <w:tc>
+          <w:tcPr>
+            <w:tcW w:w="1503" w:type="dxa"/>
+          </w:tcPr>
+          <w:p>
+            <w:pPr>
+              <w:cnfStyle w:val="000000100000" w:firstRow="0" w:lastRow="0" w:firstColumn="0" w:lastColumn="0" w:oddVBand="0" w:evenVBand="0" w:oddHBand="1" w:evenHBand="0" w:firstRowFirstColumn="0" w:firstRowLastColumn="0" w:lastRowFirstColumn="0" w:lastRowLastColumn="0"/>
+              <w:rPr>
+                <w:rFonts w:asciiTheme="majorHAnsi" w:hAnsiTheme="majorHAnsi"/>
+              </w:rPr>
+            </w:pPr>
+            <w:r>
+              <w:rPr>
+                <w:rStyle w:val="HTMLCode"/>
+                <w:rFonts w:asciiTheme="majorHAnsi" w:eastAsiaTheme="minorHAnsi" w:hAnsiTheme="majorHAnsi"/>
+                <w:sz w:val="24"/>
+                <w:szCs w:val="24"/>
+              </w:rPr>
+              <w:t>{“firstName", "lastName", "email", "password”}</w:t>
+            </w:r>
+          </w:p>
+        </w:tc>
+        <w:tc>
+          <w:tcPr>
+            <w:tcW w:w="1503" w:type="dxa"/>
+          </w:tcPr>
+          <w:p>
+            <w:pPr>
+              <w:cnfStyle w:val="000000100000" w:firstRow="0" w:lastRow="0" w:firstColumn="0" w:lastColumn="0" w:oddVBand="0" w:evenVBand="0" w:oddHBand="1" w:evenHBand="0" w:firstRowFirstColumn="0" w:firstRowLastColumn="0" w:lastRowFirstColumn="0" w:lastRowLastColumn="0"/>
+            </w:pPr>
+            <w:r>
+              <w:rPr>
+                <w:rStyle w:val="Strong"/>
+              </w:rPr>
+              <w:t>201 Created</w:t>
+            </w:r>
+            <w:r>
+              <w:t xml:space="preserve"> – Participant account created.</w:t>
+            </w:r>
+          </w:p>
+          <w:p>
+            <w:pPr>
+              <w:cnfStyle w:val="000000100000" w:firstRow="0" w:lastRow="0" w:firstColumn="0" w:lastColumn="0" w:oddVBand="0" w:evenVBand="0" w:oddHBand="1" w:evenHBand="0" w:firstRowFirstColumn="0" w:firstRowLastColumn="0" w:lastRowFirstColumn="0" w:lastRowLastColumn="0"/>
+            </w:pPr>
+            <w:r>
+              <w:t xml:space="preserve"> </w:t>
+            </w:r>
+            <w:r>
+              <w:rPr>
+                <w:rStyle w:val="Strong"/>
+              </w:rPr>
+              <w:t>400 Bad Request</w:t>
+            </w:r>
+            <w:r>
+              <w:t xml:space="preserve"> – Invalid details/email already </w:t>
+            </w:r>
+            <w:r>
+              <w:t>exist</w:t>
+            </w:r>
+            <w:r>
+              <w:t>.</w:t>
+            </w:r>
+          </w:p>
+        </w:tc>
+      </w:tr>
+      <w:tr>
+        <w:tc>
+          <w:tcPr>
+            <w:cnfStyle w:val="001000000000" w:firstRow="0" w:lastRow="0" w:firstColumn="1" w:lastColumn="0" w:oddVBand="0" w:evenVBand="0" w:oddHBand="0" w:evenHBand="0" w:firstRowFirstColumn="0" w:firstRowLastColumn="0" w:lastRowFirstColumn="0" w:lastRowLastColumn="0"/>
+            <w:tcW w:w="1502" w:type="dxa"/>
+          </w:tcPr>
+          <w:p>
+            <w:r>
+              <w:t>GET</w:t>
+            </w:r>
+          </w:p>
+        </w:tc>
+        <w:tc>
+          <w:tcPr>
+            <w:tcW w:w="1502" w:type="dxa"/>
+          </w:tcPr>
+          <w:p>
+            <w:pPr>
+              <w:cnfStyle w:val="000000000000" w:firstRow="0" w:lastRow="0" w:firstColumn="0" w:lastColumn="0" w:oddVBand="0" w:evenVBand="0" w:oddHBand="0" w:evenHBand="0" w:firstRowFirstColumn="0" w:firstRowLastColumn="0" w:lastRowFirstColumn="0" w:lastRowLastColumn="0"/>
+            </w:pPr>
+            <w:r>
+              <w:t>/api/profile</w:t>
+            </w:r>
+          </w:p>
+        </w:tc>
+        <w:tc>
+          <w:tcPr>
+            <w:tcW w:w="1503" w:type="dxa"/>
+          </w:tcPr>
+          <w:p>
+            <w:pPr>
+              <w:cnfStyle w:val="000000000000" w:firstRow="0" w:lastRow="0" w:firstColumn="0" w:lastColumn="0" w:oddVBand="0" w:evenVBand="0" w:oddHBand="0" w:evenHBand="0" w:firstRowFirstColumn="0" w:firstRowLastColumn="0" w:lastRowFirstColumn="0" w:lastRowLastColumn="0"/>
+            </w:pPr>
+            <w:r>
+              <w:t>Allows the Participant to view their own profile.</w:t>
+            </w:r>
+          </w:p>
+        </w:tc>
+        <w:tc>
+          <w:tcPr>
+            <w:tcW w:w="1503" w:type="dxa"/>
+          </w:tcPr>
+          <w:p>
+            <w:pPr>
+              <w:cnfStyle w:val="000000000000" w:firstRow="0" w:lastRow="0" w:firstColumn="0" w:lastColumn="0" w:oddVBand="0" w:evenVBand="0" w:oddHBand="0" w:evenHBand="0" w:firstRowFirstColumn="0" w:firstRowLastColumn="0" w:lastRowFirstColumn="0" w:lastRowLastColumn="0"/>
+            </w:pPr>
+            <w:r>
+              <w:t>Participant</w:t>
+            </w:r>
+          </w:p>
+        </w:tc>
+        <w:tc>
+          <w:tcPr>
+            <w:tcW w:w="1503" w:type="dxa"/>
+          </w:tcPr>
+          <w:p>
+            <w:pPr>
+              <w:cnfStyle w:val="000000000000" w:firstRow="0" w:lastRow="0" w:firstColumn="0" w:lastColumn="0" w:oddVBand="0" w:evenVBand="0" w:oddHBand="0" w:evenHBand="0" w:firstRowFirstColumn="0" w:firstRowLastColumn="0" w:lastRowFirstColumn="0" w:lastRowLastColumn="0"/>
+            </w:pPr>
+            <w:r>
+              <w:t>{“</w:t>
+            </w:r>
+            <w:r>
+              <w:t>email", "password</w:t>
+            </w:r>
+            <w:r>
+              <w:t>”}</w:t>
+            </w:r>
+          </w:p>
+        </w:tc>
+        <w:tc>
+          <w:tcPr>
+            <w:tcW w:w="1503" w:type="dxa"/>
+          </w:tcPr>
+          <w:p>
+            <w:pPr>
+              <w:cnfStyle w:val="000000000000" w:firstRow="0" w:lastRow="0" w:firstColumn="0" w:lastColumn="0" w:oddVBand="0" w:evenVBand="0" w:oddHBand="0" w:evenHBand="0" w:firstRowFirstColumn="0" w:firstRowLastColumn="0" w:lastRowFirstColumn="0" w:lastRowLastColumn="0"/>
+            </w:pPr>
+            <w:r>
+              <w:rPr>
+                <w:b/>
+                <w:bCs/>
+              </w:rPr>
+              <w:t>200 OK</w:t>
+            </w:r>
+            <w:r>
+              <w:t xml:space="preserve"> – Token and participant details. </w:t>
+            </w:r>
+            <w:r>
+              <w:rPr>
+                <w:b/>
+                <w:bCs/>
+              </w:rPr>
+              <w:t>401 Unauthorized</w:t>
+            </w:r>
+            <w:r>
+              <w:t xml:space="preserve"> – Invalid credentials.</w:t>
+            </w:r>
+          </w:p>
+        </w:tc>
+      </w:tr>
+      <w:tr>
+        <w:trPr>
+          <w:cnfStyle w:val="000000100000" w:firstRow="0" w:lastRow="0" w:firstColumn="0" w:lastColumn="0" w:oddVBand="0" w:evenVBand="0" w:oddHBand="1" w:evenHBand="0" w:firstRowFirstColumn="0" w:firstRowLastColumn="0" w:lastRowFirstColumn="0" w:lastRowLastColumn="0"/>
+        </w:trPr>
+        <w:tc>
+          <w:tcPr>
+            <w:cnfStyle w:val="001000000000" w:firstRow="0" w:lastRow="0" w:firstColumn="1" w:lastColumn="0" w:oddVBand="0" w:evenVBand="0" w:oddHBand="0" w:evenHBand="0" w:firstRowFirstColumn="0" w:firstRowLastColumn="0" w:lastRowFirstColumn="0" w:lastRowLastColumn="0"/>
+            <w:tcW w:w="1502" w:type="dxa"/>
+          </w:tcPr>
+          <w:p>
+            <w:r>
+              <w:t>PUT</w:t>
+            </w:r>
+          </w:p>
+        </w:tc>
+        <w:tc>
+          <w:tcPr>
+            <w:tcW w:w="1502" w:type="dxa"/>
+          </w:tcPr>
+          <w:p>
+            <w:pPr>
+              <w:cnfStyle w:val="000000100000" w:firstRow="0" w:lastRow="0" w:firstColumn="0" w:lastColumn="0" w:oddVBand="0" w:evenVBand="0" w:oddHBand="1" w:evenHBand="0" w:firstRowFirstColumn="0" w:firstRowLastColumn="0" w:lastRowFirstColumn="0" w:lastRowLastColumn="0"/>
+            </w:pPr>
+            <w:r>
+              <w:t>/api/profile</w:t>
+            </w:r>
+          </w:p>
+        </w:tc>
+        <w:tc>
+          <w:tcPr>
+            <w:tcW w:w="1503" w:type="dxa"/>
+          </w:tcPr>
+          <w:p>
+            <w:pPr>
+              <w:jc w:val="center"/>
+              <w:cnfStyle w:val="000000100000" w:firstRow="0" w:lastRow="0" w:firstColumn="0" w:lastColumn="0" w:oddVBand="0" w:evenVBand="0" w:oddHBand="1" w:evenHBand="0" w:firstRowFirstColumn="0" w:firstRowLastColumn="0" w:lastRowFirstColumn="0" w:lastRowLastColumn="0"/>
+            </w:pPr>
+            <w:r>
+              <w:t>Allows the Participant to update their profile.</w:t>
+            </w:r>
+          </w:p>
+        </w:tc>
+        <w:tc>
+          <w:tcPr>
+            <w:tcW w:w="1503" w:type="dxa"/>
+          </w:tcPr>
+          <w:p>
+            <w:pPr>
+              <w:cnfStyle w:val="000000100000" w:firstRow="0" w:lastRow="0" w:firstColumn="0" w:lastColumn="0" w:oddVBand="0" w:evenVBand="0" w:oddHBand="1" w:evenHBand="0" w:firstRowFirstColumn="0" w:firstRowLastColumn="0" w:lastRowFirstColumn="0" w:lastRowLastColumn="0"/>
+            </w:pPr>
+            <w:r>
+              <w:t>Participant</w:t>
+            </w:r>
+          </w:p>
+        </w:tc>
+        <w:tc>
+          <w:tcPr>
+            <w:tcW w:w="1503" w:type="dxa"/>
+          </w:tcPr>
+          <w:p>
+            <w:pPr>
+              <w:cnfStyle w:val="000000100000" w:firstRow="0" w:lastRow="0" w:firstColumn="0" w:lastColumn="0" w:oddVBand="0" w:evenVBand="0" w:oddHBand="1" w:evenHBand="0" w:firstRowFirstColumn="0" w:firstRowLastColumn="0" w:lastRowFirstColumn="0" w:lastRowLastColumn="0"/>
+            </w:pPr>
+            <w:r>
+              <w:t>None</w:t>
+            </w:r>
+          </w:p>
+        </w:tc>
+        <w:tc>
+          <w:tcPr>
+            <w:tcW w:w="1503" w:type="dxa"/>
+          </w:tcPr>
+          <w:tbl>
+            <w:tblPr>
+              <w:tblW w:w="0" w:type="auto"/>
+              <w:tblCellSpacing w:w="15" w:type="dxa"/>
+              <w:tblCellMar>
+                <w:top w:w="15" w:type="dxa"/>
+                <w:left w:w="15" w:type="dxa"/>
+                <w:bottom w:w="15" w:type="dxa"/>
+                <w:right w:w="15" w:type="dxa"/>
+              </w:tblCellMar>
+              <w:tblLook w:val="04A0" w:firstRow="1" w:lastRow="0" w:firstColumn="1" w:lastColumn="0" w:noHBand="0" w:noVBand="1"/>
+            </w:tblPr>
+            <w:tblGrid>
+              <w:gridCol w:w="96"/>
+            </w:tblGrid>
+            <w:tr>
+              <w:trPr>
+                <w:tblCellSpacing w:w="15" w:type="dxa"/>
+              </w:trPr>
+              <w:tc>
+                <w:tcPr>
+                  <w:tcW w:w="0" w:type="auto"/>
+                  <w:vAlign w:val="center"/>
+                  <w:hideMark/>
+                </w:tcPr>
+                <w:p>
+                  <w:pPr>
+                    <w:framePr w:hSpace="180" w:wrap="around" w:vAnchor="page" w:hAnchor="margin" w:y="3097"/>
+                    <w:spacing w:after="0" w:line="240" w:lineRule="auto"/>
+                  </w:pPr>
+                </w:p>
+              </w:tc>
+            </w:tr>
+          </w:tbl>
+          <w:p>
+            <w:pPr>
+              <w:cnfStyle w:val="000000100000" w:firstRow="0" w:lastRow="0" w:firstColumn="0" w:lastColumn="0" w:oddVBand="0" w:evenVBand="0" w:oddHBand="1" w:evenHBand="0" w:firstRowFirstColumn="0" w:firstRowLastColumn="0" w:lastRowFirstColumn="0" w:lastRowLastColumn="0"/>
+              <w:rPr>
+                <w:vanish/>
+              </w:rPr>
+            </w:pPr>
+          </w:p>
+          <w:tbl>
+            <w:tblPr>
+              <w:tblW w:w="0" w:type="auto"/>
+              <w:tblCellSpacing w:w="15" w:type="dxa"/>
+              <w:tblCellMar>
+                <w:top w:w="15" w:type="dxa"/>
+                <w:left w:w="15" w:type="dxa"/>
+                <w:bottom w:w="15" w:type="dxa"/>
+                <w:right w:w="15" w:type="dxa"/>
+              </w:tblCellMar>
+              <w:tblLook w:val="04A0" w:firstRow="1" w:lastRow="0" w:firstColumn="1" w:lastColumn="0" w:noHBand="0" w:noVBand="1"/>
+            </w:tblPr>
+            <w:tblGrid>
+              <w:gridCol w:w="1213"/>
+            </w:tblGrid>
+            <w:tr>
+              <w:trPr>
+                <w:tblCellSpacing w:w="15" w:type="dxa"/>
+              </w:trPr>
+              <w:tc>
+                <w:tcPr>
+                  <w:tcW w:w="0" w:type="auto"/>
+                  <w:vAlign w:val="center"/>
+                  <w:hideMark/>
+                </w:tcPr>
+                <w:p>
+                  <w:pPr>
+                    <w:framePr w:hSpace="180" w:wrap="around" w:vAnchor="page" w:hAnchor="margin" w:y="3097"/>
+                    <w:spacing w:after="0" w:line="240" w:lineRule="auto"/>
+                  </w:pPr>
+                  <w:r>
+                    <w:rPr>
+                      <w:b/>
+                      <w:bCs/>
+                    </w:rPr>
+                    <w:t>200 OK</w:t>
+                  </w:r>
+                  <w:r>
+                    <w:t xml:space="preserve"> – Profile details. </w:t>
+                  </w:r>
+                  <w:r>
+                    <w:rPr>
+                      <w:b/>
+                      <w:bCs/>
+                    </w:rPr>
+                    <w:t>401 Unauthorized</w:t>
+                  </w:r>
+                  <w:r>
+                    <w:t xml:space="preserve"> – Not logged in</w:t>
+                  </w:r>
+                </w:p>
+              </w:tc>
+            </w:tr>
+          </w:tbl>
+          <w:p>
+            <w:pPr>
+              <w:cnfStyle w:val="000000100000" w:firstRow="0" w:lastRow="0" w:firstColumn="0" w:lastColumn="0" w:oddVBand="0" w:evenVBand="0" w:oddHBand="1" w:evenHBand="0" w:firstRowFirstColumn="0" w:firstRowLastColumn="0" w:lastRowFirstColumn="0" w:lastRowLastColumn="0"/>
+            </w:pPr>
+          </w:p>
+        </w:tc>
+      </w:tr>
+      <w:tr>
+        <w:tc>
+          <w:tcPr>
+            <w:cnfStyle w:val="001000000000" w:firstRow="0" w:lastRow="0" w:firstColumn="1" w:lastColumn="0" w:oddVBand="0" w:evenVBand="0" w:oddHBand="0" w:evenHBand="0" w:firstRowFirstColumn="0" w:firstRowLastColumn="0" w:lastRowFirstColumn="0" w:lastRowLastColumn="0"/>
+            <w:tcW w:w="1502" w:type="dxa"/>
+          </w:tcPr>
+          <w:p>
+            <w:r>
+              <w:t>GET</w:t>
+            </w:r>
+          </w:p>
+        </w:tc>
+        <w:tc>
+          <w:tcPr>
+            <w:tcW w:w="1502" w:type="dxa"/>
+          </w:tcPr>
+          <w:p>
+            <w:pPr>
+              <w:cnfStyle w:val="000000000000" w:firstRow="0" w:lastRow="0" w:firstColumn="0" w:lastColumn="0" w:oddVBand="0" w:evenVBand="0" w:oddHBand="0" w:evenHBand="0" w:firstRowFirstColumn="0" w:firstRowLastColumn="0" w:lastRowFirstColumn="0" w:lastRowLastColumn="0"/>
+            </w:pPr>
+            <w:r>
+              <w:t>/api/events</w:t>
+            </w:r>
+          </w:p>
+        </w:tc>
+        <w:tc>
+          <w:tcPr>
+            <w:tcW w:w="1503" w:type="dxa"/>
+          </w:tcPr>
+          <w:tbl>
+            <w:tblPr>
+              <w:tblW w:w="0" w:type="auto"/>
+              <w:tblCellSpacing w:w="15" w:type="dxa"/>
+              <w:tblCellMar>
+                <w:top w:w="15" w:type="dxa"/>
+                <w:left w:w="15" w:type="dxa"/>
+                <w:bottom w:w="15" w:type="dxa"/>
+                <w:right w:w="15" w:type="dxa"/>
+              </w:tblCellMar>
+              <w:tblLook w:val="04A0" w:firstRow="1" w:lastRow="0" w:firstColumn="1" w:lastColumn="0" w:noHBand="0" w:noVBand="1"/>
+            </w:tblPr>
+            <w:tblGrid>
+              <w:gridCol w:w="96"/>
+            </w:tblGrid>
+            <w:tr>
+              <w:trPr>
+                <w:tblCellSpacing w:w="15" w:type="dxa"/>
+              </w:trPr>
+              <w:tc>
+                <w:tcPr>
+                  <w:tcW w:w="0" w:type="auto"/>
+                  <w:vAlign w:val="center"/>
+                  <w:hideMark/>
+                </w:tcPr>
+                <w:p>
+                  <w:pPr>
+                    <w:framePr w:hSpace="180" w:wrap="around" w:vAnchor="page" w:hAnchor="margin" w:y="3097"/>
+                    <w:spacing w:after="0" w:line="240" w:lineRule="auto"/>
+                  </w:pPr>
+                </w:p>
+              </w:tc>
+            </w:tr>
+          </w:tbl>
+          <w:p>
+            <w:pPr>
+              <w:cnfStyle w:val="000000000000" w:firstRow="0" w:lastRow="0" w:firstColumn="0" w:lastColumn="0" w:oddVBand="0" w:evenVBand="0" w:oddHBand="0" w:evenHBand="0" w:firstRowFirstColumn="0" w:firstRowLastColumn="0" w:lastRowFirstColumn="0" w:lastRowLastColumn="0"/>
+              <w:rPr>
+                <w:vanish/>
+              </w:rPr>
+            </w:pPr>
+          </w:p>
+          <w:tbl>
+            <w:tblPr>
+              <w:tblW w:w="0" w:type="auto"/>
+              <w:tblCellSpacing w:w="15" w:type="dxa"/>
+              <w:tblCellMar>
+                <w:top w:w="15" w:type="dxa"/>
+                <w:left w:w="15" w:type="dxa"/>
+                <w:bottom w:w="15" w:type="dxa"/>
+                <w:right w:w="15" w:type="dxa"/>
+              </w:tblCellMar>
+              <w:tblLook w:val="04A0" w:firstRow="1" w:lastRow="0" w:firstColumn="1" w:lastColumn="0" w:noHBand="0" w:noVBand="1"/>
+            </w:tblPr>
+            <w:tblGrid>
+              <w:gridCol w:w="975"/>
+            </w:tblGrid>
+            <w:tr>
+              <w:trPr>
+                <w:tblCellSpacing w:w="15" w:type="dxa"/>
+              </w:trPr>
+              <w:tc>
+                <w:tcPr>
+                  <w:tcW w:w="0" w:type="auto"/>
+                  <w:vAlign w:val="center"/>
+                  <w:hideMark/>
+                </w:tcPr>
+                <w:p>
+                  <w:pPr>
+                    <w:framePr w:hSpace="180" w:wrap="around" w:vAnchor="page" w:hAnchor="margin" w:y="3097"/>
+                    <w:spacing w:after="0" w:line="240" w:lineRule="auto"/>
+                  </w:pPr>
+                  <w:r>
+                    <w:t>Allows the Participant to browse available events.</w:t>
+                  </w:r>
+                </w:p>
+              </w:tc>
+            </w:tr>
+          </w:tbl>
+          <w:p>
+            <w:pPr>
+              <w:cnfStyle w:val="000000000000" w:firstRow="0" w:lastRow="0" w:firstColumn="0" w:lastColumn="0" w:oddVBand="0" w:evenVBand="0" w:oddHBand="0" w:evenHBand="0" w:firstRowFirstColumn="0" w:firstRowLastColumn="0" w:lastRowFirstColumn="0" w:lastRowLastColumn="0"/>
+            </w:pPr>
+          </w:p>
+        </w:tc>
+        <w:tc>
+          <w:tcPr>
+            <w:tcW w:w="1503" w:type="dxa"/>
+          </w:tcPr>
+          <w:p>
+            <w:pPr>
+              <w:cnfStyle w:val="000000000000" w:firstRow="0" w:lastRow="0" w:firstColumn="0" w:lastColumn="0" w:oddVBand="0" w:evenVBand="0" w:oddHBand="0" w:evenHBand="0" w:firstRowFirstColumn="0" w:firstRowLastColumn="0" w:lastRowFirstColumn="0" w:lastRowLastColumn="0"/>
+            </w:pPr>
+            <w:r>
+              <w:t>Participant</w:t>
+            </w:r>
+          </w:p>
+        </w:tc>
+        <w:tc>
+          <w:tcPr>
+            <w:tcW w:w="1503" w:type="dxa"/>
+          </w:tcPr>
+          <w:tbl>
+            <w:tblPr>
+              <w:tblW w:w="0" w:type="auto"/>
+              <w:tblCellSpacing w:w="15" w:type="dxa"/>
+              <w:tblCellMar>
+                <w:top w:w="15" w:type="dxa"/>
+                <w:left w:w="15" w:type="dxa"/>
+                <w:bottom w:w="15" w:type="dxa"/>
+                <w:right w:w="15" w:type="dxa"/>
+              </w:tblCellMar>
+              <w:tblLook w:val="04A0" w:firstRow="1" w:lastRow="0" w:firstColumn="1" w:lastColumn="0" w:noHBand="0" w:noVBand="1"/>
+            </w:tblPr>
+            <w:tblGrid>
+              <w:gridCol w:w="96"/>
+            </w:tblGrid>
+            <w:tr>
+              <w:trPr>
+                <w:tblCellSpacing w:w="15" w:type="dxa"/>
+              </w:trPr>
+              <w:tc>
+                <w:tcPr>
+                  <w:tcW w:w="0" w:type="auto"/>
+                  <w:vAlign w:val="center"/>
+                  <w:hideMark/>
+                </w:tcPr>
+                <w:p>
+                  <w:pPr>
+                    <w:framePr w:hSpace="180" w:wrap="around" w:vAnchor="page" w:hAnchor="margin" w:y="3097"/>
+                    <w:spacing w:after="0" w:line="240" w:lineRule="auto"/>
+                  </w:pPr>
+                </w:p>
+              </w:tc>
+            </w:tr>
+          </w:tbl>
+          <w:p>
+            <w:pPr>
+              <w:cnfStyle w:val="000000000000" w:firstRow="0" w:lastRow="0" w:firstColumn="0" w:lastColumn="0" w:oddVBand="0" w:evenVBand="0" w:oddHBand="0" w:evenHBand="0" w:firstRowFirstColumn="0" w:firstRowLastColumn="0" w:lastRowFirstColumn="0" w:lastRowLastColumn="0"/>
+              <w:rPr>
+                <w:vanish/>
+              </w:rPr>
+            </w:pPr>
+          </w:p>
+          <w:tbl>
+            <w:tblPr>
+              <w:tblW w:w="0" w:type="auto"/>
+              <w:tblCellSpacing w:w="15" w:type="dxa"/>
+              <w:tblCellMar>
+                <w:top w:w="15" w:type="dxa"/>
+                <w:left w:w="15" w:type="dxa"/>
+                <w:bottom w:w="15" w:type="dxa"/>
+                <w:right w:w="15" w:type="dxa"/>
+              </w:tblCellMar>
+              <w:tblLook w:val="04A0" w:firstRow="1" w:lastRow="0" w:firstColumn="1" w:lastColumn="0" w:noHBand="0" w:noVBand="1"/>
+            </w:tblPr>
+            <w:tblGrid>
+              <w:gridCol w:w="2297"/>
+            </w:tblGrid>
+            <w:tr>
+              <w:trPr>
+                <w:tblCellSpacing w:w="15" w:type="dxa"/>
+              </w:trPr>
+              <w:tc>
+                <w:tcPr>
+                  <w:tcW w:w="0" w:type="auto"/>
+                  <w:vAlign w:val="center"/>
+                  <w:hideMark/>
+                </w:tcPr>
+                <w:p>
+                  <w:pPr>
+                    <w:framePr w:hSpace="180" w:wrap="around" w:vAnchor="page" w:hAnchor="margin" w:y="3097"/>
+                    <w:spacing w:after="0" w:line="240" w:lineRule="auto"/>
+                  </w:pPr>
+                  <w:r>
+                    <w:t>{“</w:t>
+                  </w:r>
+                  <w:r>
+                    <w:t>phoneNumber", "dateOfBirth", "address", "emergencyContactName", "emergencyContactPhone</w:t>
+                  </w:r>
+                  <w:r>
+                    <w:t>”}</w:t>
+                  </w:r>
+                </w:p>
+              </w:tc>
+            </w:tr>
+          </w:tbl>
+          <w:p>
+            <w:pPr>
+              <w:cnfStyle w:val="000000000000" w:firstRow="0" w:lastRow="0" w:firstColumn="0" w:lastColumn="0" w:oddVBand="0" w:evenVBand="0" w:oddHBand="0" w:evenHBand="0" w:firstRowFirstColumn="0" w:firstRowLastColumn="0" w:lastRowFirstColumn="0" w:lastRowLastColumn="0"/>
+            </w:pPr>
+          </w:p>
+        </w:tc>
+        <w:tc>
+          <w:tcPr>
+            <w:tcW w:w="1503" w:type="dxa"/>
+          </w:tcPr>
+          <w:p>
+            <w:pPr>
+              <w:cnfStyle w:val="000000000000" w:firstRow="0" w:lastRow="0" w:firstColumn="0" w:lastColumn="0" w:oddVBand="0" w:evenVBand="0" w:oddHBand="0" w:evenHBand="0" w:firstRowFirstColumn="0" w:firstRowLastColumn="0" w:lastRowFirstColumn="0" w:lastRowLastColumn="0"/>
+            </w:pPr>
+          </w:p>
+          <w:p>
+            <w:pPr>
+              <w:cnfStyle w:val="000000000000" w:firstRow="0" w:lastRow="0" w:firstColumn="0" w:lastColumn="0" w:oddVBand="0" w:evenVBand="0" w:oddHBand="0" w:evenHBand="0" w:firstRowFirstColumn="0" w:firstRowLastColumn="0" w:lastRowFirstColumn="0" w:lastRowLastColumn="0"/>
+            </w:pPr>
+          </w:p>
+          <w:p>
+            <w:pPr>
+              <w:jc w:val="center"/>
+              <w:cnfStyle w:val="000000000000" w:firstRow="0" w:lastRow="0" w:firstColumn="0" w:lastColumn="0" w:oddVBand="0" w:evenVBand="0" w:oddHBand="0" w:evenHBand="0" w:firstRowFirstColumn="0" w:firstRowLastColumn="0" w:lastRowFirstColumn="0" w:lastRowLastColumn="0"/>
+            </w:pPr>
+            <w:r>
+              <w:rPr>
+                <w:b/>
+                <w:bCs/>
+              </w:rPr>
+              <w:t>200 OK</w:t>
+            </w:r>
+            <w:r>
+              <w:t xml:space="preserve"> – Updated profile. </w:t>
+            </w:r>
+            <w:r>
+              <w:rPr>
+                <w:b/>
+                <w:bCs/>
+              </w:rPr>
+              <w:t>400 Bad Request</w:t>
+            </w:r>
+            <w:r>
+              <w:t xml:space="preserve"> – Invalid information.</w:t>
+            </w:r>
+          </w:p>
+        </w:tc>
+      </w:tr>
+      <w:tr>
+        <w:trPr>
+          <w:cnfStyle w:val="000000100000" w:firstRow="0" w:lastRow="0" w:firstColumn="0" w:lastColumn="0" w:oddVBand="0" w:evenVBand="0" w:oddHBand="1" w:evenHBand="0" w:firstRowFirstColumn="0" w:firstRowLastColumn="0" w:lastRowFirstColumn="0" w:lastRowLastColumn="0"/>
+        </w:trPr>
+        <w:tc>
+          <w:tcPr>
+            <w:cnfStyle w:val="001000000000" w:firstRow="0" w:lastRow="0" w:firstColumn="1" w:lastColumn="0" w:oddVBand="0" w:evenVBand="0" w:oddHBand="0" w:evenHBand="0" w:firstRowFirstColumn="0" w:firstRowLastColumn="0" w:lastRowFirstColumn="0" w:lastRowLastColumn="0"/>
+            <w:tcW w:w="1502" w:type="dxa"/>
+          </w:tcPr>
+          <w:p>
+            <w:r>
+              <w:lastRenderedPageBreak/>
+              <w:t>GET</w:t>
+            </w:r>
+          </w:p>
+        </w:tc>
+        <w:tc>
+          <w:tcPr>
+            <w:tcW w:w="1502" w:type="dxa"/>
+          </w:tcPr>
+          <w:p>
+            <w:pPr>
+              <w:cnfStyle w:val="000000100000" w:firstRow="0" w:lastRow="0" w:firstColumn="0" w:lastColumn="0" w:oddVBand="0" w:evenVBand="0" w:oddHBand="1" w:evenHBand="0" w:firstRowFirstColumn="0" w:firstRowLastColumn="0" w:lastRowFirstColumn="0" w:lastRowLastColumn="0"/>
+            </w:pPr>
+            <w:r>
+              <w:t>/api/events</w:t>
+            </w:r>
+          </w:p>
+        </w:tc>
+        <w:tc>
+          <w:tcPr>
+            <w:tcW w:w="1503" w:type="dxa"/>
+          </w:tcPr>
+          <w:tbl>
+            <w:tblPr>
+              <w:tblW w:w="0" w:type="auto"/>
+              <w:tblCellSpacing w:w="15" w:type="dxa"/>
+              <w:tblCellMar>
+                <w:top w:w="15" w:type="dxa"/>
+                <w:left w:w="15" w:type="dxa"/>
+                <w:bottom w:w="15" w:type="dxa"/>
+                <w:right w:w="15" w:type="dxa"/>
+              </w:tblCellMar>
+              <w:tblLook w:val="04A0" w:firstRow="1" w:lastRow="0" w:firstColumn="1" w:lastColumn="0" w:noHBand="0" w:noVBand="1"/>
+            </w:tblPr>
+            <w:tblGrid>
+              <w:gridCol w:w="96"/>
+            </w:tblGrid>
+            <w:tr>
+              <w:trPr>
+                <w:tblCellSpacing w:w="15" w:type="dxa"/>
+              </w:trPr>
+              <w:tc>
+                <w:tcPr>
+                  <w:tcW w:w="0" w:type="auto"/>
+                  <w:vAlign w:val="center"/>
+                  <w:hideMark/>
+                </w:tcPr>
+                <w:p>
+                  <w:pPr>
+                    <w:framePr w:hSpace="180" w:wrap="around" w:vAnchor="page" w:hAnchor="margin" w:y="3097"/>
+                    <w:spacing w:after="0" w:line="240" w:lineRule="auto"/>
+                  </w:pPr>
+                </w:p>
+              </w:tc>
+            </w:tr>
+          </w:tbl>
+          <w:p>
+            <w:pPr>
+              <w:cnfStyle w:val="000000100000" w:firstRow="0" w:lastRow="0" w:firstColumn="0" w:lastColumn="0" w:oddVBand="0" w:evenVBand="0" w:oddHBand="1" w:evenHBand="0" w:firstRowFirstColumn="0" w:firstRowLastColumn="0" w:lastRowFirstColumn="0" w:lastRowLastColumn="0"/>
+              <w:rPr>
+                <w:vanish/>
+              </w:rPr>
+            </w:pPr>
+          </w:p>
+          <w:tbl>
+            <w:tblPr>
+              <w:tblW w:w="0" w:type="auto"/>
+              <w:tblCellSpacing w:w="15" w:type="dxa"/>
+              <w:tblCellMar>
+                <w:top w:w="15" w:type="dxa"/>
+                <w:left w:w="15" w:type="dxa"/>
+                <w:bottom w:w="15" w:type="dxa"/>
+                <w:right w:w="15" w:type="dxa"/>
+              </w:tblCellMar>
+              <w:tblLook w:val="04A0" w:firstRow="1" w:lastRow="0" w:firstColumn="1" w:lastColumn="0" w:noHBand="0" w:noVBand="1"/>
+            </w:tblPr>
+            <w:tblGrid>
+              <w:gridCol w:w="975"/>
+            </w:tblGrid>
+            <w:tr>
+              <w:trPr>
+                <w:tblCellSpacing w:w="15" w:type="dxa"/>
+              </w:trPr>
+              <w:tc>
+                <w:tcPr>
+                  <w:tcW w:w="0" w:type="auto"/>
+                  <w:vAlign w:val="center"/>
+                  <w:hideMark/>
+                </w:tcPr>
+                <w:p>
+                  <w:pPr>
+                    <w:framePr w:hSpace="180" w:wrap="around" w:vAnchor="page" w:hAnchor="margin" w:y="3097"/>
+                    <w:spacing w:after="0" w:line="240" w:lineRule="auto"/>
+                  </w:pPr>
+                  <w:r>
+                    <w:t>Allows the Participant to browse available events.</w:t>
+                  </w:r>
+                </w:p>
+              </w:tc>
+            </w:tr>
+          </w:tbl>
+          <w:p>
+            <w:pPr>
+              <w:cnfStyle w:val="000000100000" w:firstRow="0" w:lastRow="0" w:firstColumn="0" w:lastColumn="0" w:oddVBand="0" w:evenVBand="0" w:oddHBand="1" w:evenHBand="0" w:firstRowFirstColumn="0" w:firstRowLastColumn="0" w:lastRowFirstColumn="0" w:lastRowLastColumn="0"/>
+            </w:pPr>
+          </w:p>
+        </w:tc>
+        <w:tc>
+          <w:tcPr>
+            <w:tcW w:w="1503" w:type="dxa"/>
+          </w:tcPr>
+          <w:p>
+            <w:pPr>
+              <w:cnfStyle w:val="000000100000" w:firstRow="0" w:lastRow="0" w:firstColumn="0" w:lastColumn="0" w:oddVBand="0" w:evenVBand="0" w:oddHBand="1" w:evenHBand="0" w:firstRowFirstColumn="0" w:firstRowLastColumn="0" w:lastRowFirstColumn="0" w:lastRowLastColumn="0"/>
+            </w:pPr>
+            <w:r>
+              <w:t>Participant</w:t>
+            </w:r>
+          </w:p>
+        </w:tc>
+        <w:tc>
+          <w:tcPr>
+            <w:tcW w:w="1503" w:type="dxa"/>
+          </w:tcPr>
+          <w:p>
+            <w:pPr>
+              <w:cnfStyle w:val="000000100000" w:firstRow="0" w:lastRow="0" w:firstColumn="0" w:lastColumn="0" w:oddVBand="0" w:evenVBand="0" w:oddHBand="1" w:evenHBand="0" w:firstRowFirstColumn="0" w:firstRowLastColumn="0" w:lastRowFirstColumn="0" w:lastRowLastColumn="0"/>
+            </w:pPr>
+            <w:r>
+              <w:t>None</w:t>
+            </w:r>
+          </w:p>
+        </w:tc>
+        <w:tc>
+          <w:tcPr>
+            <w:tcW w:w="1503" w:type="dxa"/>
+          </w:tcPr>
+          <w:p>
+            <w:pPr>
+              <w:cnfStyle w:val="000000100000" w:firstRow="0" w:lastRow="0" w:firstColumn="0" w:lastColumn="0" w:oddVBand="0" w:evenVBand="0" w:oddHBand="1" w:evenHBand="0" w:firstRowFirstColumn="0" w:firstRowLastColumn="0" w:lastRowFirstColumn="0" w:lastRowLastColumn="0"/>
+            </w:pPr>
+            <w:r>
+              <w:rPr>
+                <w:b/>
+                <w:bCs/>
+              </w:rPr>
+              <w:t>200 OK</w:t>
+            </w:r>
+            <w:r>
+              <w:t xml:space="preserve"> – List of events.</w:t>
+            </w:r>
+          </w:p>
+        </w:tc>
+      </w:tr>
+      <w:tr>
+        <w:tc>
+          <w:tcPr>
+            <w:cnfStyle w:val="001000000000" w:firstRow="0" w:lastRow="0" w:firstColumn="1" w:lastColumn="0" w:oddVBand="0" w:evenVBand="0" w:oddHBand="0" w:evenHBand="0" w:firstRowFirstColumn="0" w:firstRowLastColumn="0" w:lastRowFirstColumn="0" w:lastRowLastColumn="0"/>
+            <w:tcW w:w="1502" w:type="dxa"/>
+          </w:tcPr>
+          <w:p>
+            <w:r>
+              <w:t>POST</w:t>
+            </w:r>
+          </w:p>
+        </w:tc>
+        <w:tc>
+          <w:tcPr>
+            <w:tcW w:w="1502" w:type="dxa"/>
+          </w:tcPr>
+          <w:p>
+            <w:pPr>
+              <w:cnfStyle w:val="000000000000" w:firstRow="0" w:lastRow="0" w:firstColumn="0" w:lastColumn="0" w:oddVBand="0" w:evenVBand="0" w:oddHBand="0" w:evenHBand="0" w:firstRowFirstColumn="0" w:firstRowLastColumn="0" w:lastRowFirstColumn="0" w:lastRowLastColumn="0"/>
+            </w:pPr>
+            <w:r>
+              <w:t>/</w:t>
+            </w:r>
+            <w:proofErr w:type="gramStart"/>
+            <w:r>
+              <w:t>api</w:t>
+            </w:r>
+            <w:proofErr w:type="gramEnd"/>
+            <w:r>
+              <w:t>/events/{id}</w:t>
+            </w:r>
+          </w:p>
+        </w:tc>
+        <w:tc>
+          <w:tcPr>
+            <w:tcW w:w="1503" w:type="dxa"/>
+          </w:tcPr>
+          <w:p>
+            <w:pPr>
+              <w:cnfStyle w:val="000000000000" w:firstRow="0" w:lastRow="0" w:firstColumn="0" w:lastColumn="0" w:oddVBand="0" w:evenVBand="0" w:oddHBand="0" w:evenHBand="0" w:firstRowFirstColumn="0" w:firstRowLastColumn="0" w:lastRowFirstColumn="0" w:lastRowLastColumn="0"/>
+            </w:pPr>
+            <w:r>
+              <w:t>Allows the Participant to view details of a specific event.</w:t>
+            </w:r>
+          </w:p>
+        </w:tc>
+        <w:tc>
+          <w:tcPr>
+            <w:tcW w:w="1503" w:type="dxa"/>
+          </w:tcPr>
+          <w:p>
+            <w:pPr>
+              <w:cnfStyle w:val="000000000000" w:firstRow="0" w:lastRow="0" w:firstColumn="0" w:lastColumn="0" w:oddVBand="0" w:evenVBand="0" w:oddHBand="0" w:evenHBand="0" w:firstRowFirstColumn="0" w:firstRowLastColumn="0" w:lastRowFirstColumn="0" w:lastRowLastColumn="0"/>
+            </w:pPr>
+            <w:r>
+              <w:t>Participant</w:t>
+            </w:r>
+          </w:p>
+        </w:tc>
+        <w:tc>
+          <w:tcPr>
+            <w:tcW w:w="1503" w:type="dxa"/>
+          </w:tcPr>
+          <w:p>
+            <w:pPr>
+              <w:cnfStyle w:val="000000000000" w:firstRow="0" w:lastRow="0" w:firstColumn="0" w:lastColumn="0" w:oddVBand="0" w:evenVBand="0" w:oddHBand="0" w:evenHBand="0" w:firstRowFirstColumn="0" w:firstRowLastColumn="0" w:lastRowFirstColumn="0" w:lastRowLastColumn="0"/>
+            </w:pPr>
+            <w:r>
+              <w:t>None</w:t>
+            </w:r>
+          </w:p>
+        </w:tc>
+        <w:tc>
+          <w:tcPr>
+            <w:tcW w:w="1503" w:type="dxa"/>
+          </w:tcPr>
+          <w:p>
+            <w:pPr>
+              <w:cnfStyle w:val="000000000000" w:firstRow="0" w:lastRow="0" w:firstColumn="0" w:lastColumn="0" w:oddVBand="0" w:evenVBand="0" w:oddHBand="0" w:evenHBand="0" w:firstRowFirstColumn="0" w:firstRowLastColumn="0" w:lastRowFirstColumn="0" w:lastRowLastColumn="0"/>
+            </w:pPr>
+            <w:r>
+              <w:rPr>
+                <w:b/>
+                <w:bCs/>
+              </w:rPr>
+              <w:t>201 Created</w:t>
+            </w:r>
+            <w:r>
+              <w:t xml:space="preserve"> – </w:t>
+            </w:r>
+            <w:r>
+              <w:t>Enrolment</w:t>
+            </w:r>
+            <w:r>
+              <w:t xml:space="preserve"> created. </w:t>
+            </w:r>
+            <w:r>
+              <w:rPr>
+                <w:b/>
+                <w:bCs/>
+              </w:rPr>
+              <w:t>409 Conflict</w:t>
+            </w:r>
+            <w:r>
+              <w:t xml:space="preserve"> – Already enrolled/full.</w:t>
+            </w:r>
+          </w:p>
+        </w:tc>
+      </w:tr>
+      <w:tr>
+        <w:trPr>
+          <w:cnfStyle w:val="000000100000" w:firstRow="0" w:lastRow="0" w:firstColumn="0" w:lastColumn="0" w:oddVBand="0" w:evenVBand="0" w:oddHBand="1" w:evenHBand="0" w:firstRowFirstColumn="0" w:firstRowLastColumn="0" w:lastRowFirstColumn="0" w:lastRowLastColumn="0"/>
+        </w:trPr>
+        <w:tc>
+          <w:tcPr>
+            <w:cnfStyle w:val="001000000000" w:firstRow="0" w:lastRow="0" w:firstColumn="1" w:lastColumn="0" w:oddVBand="0" w:evenVBand="0" w:oddHBand="0" w:evenHBand="0" w:firstRowFirstColumn="0" w:firstRowLastColumn="0" w:lastRowFirstColumn="0" w:lastRowLastColumn="0"/>
+            <w:tcW w:w="1502" w:type="dxa"/>
+          </w:tcPr>
+          <w:p>
+            <w:r>
+              <w:t>GET</w:t>
+            </w:r>
+          </w:p>
+        </w:tc>
+        <w:tc>
+          <w:tcPr>
+            <w:tcW w:w="1502" w:type="dxa"/>
+          </w:tcPr>
+          <w:p>
+            <w:pPr>
+              <w:cnfStyle w:val="000000100000" w:firstRow="0" w:lastRow="0" w:firstColumn="0" w:lastColumn="0" w:oddVBand="0" w:evenVBand="0" w:oddHBand="1" w:evenHBand="0" w:firstRowFirstColumn="0" w:firstRowLastColumn="0" w:lastRowFirstColumn="0" w:lastRowLastColumn="0"/>
+            </w:pPr>
+            <w:r>
+              <w:t>/api/</w:t>
+            </w:r>
+            <w:r>
+              <w:t>enrolments</w:t>
+            </w:r>
+            <w:r>
+              <w:t>/my</w:t>
+            </w:r>
+          </w:p>
+        </w:tc>
+        <w:tc>
+          <w:tcPr>
+            <w:tcW w:w="1503" w:type="dxa"/>
+          </w:tcPr>
+          <w:p>
+            <w:pPr>
+              <w:cnfStyle w:val="000000100000" w:firstRow="0" w:lastRow="0" w:firstColumn="0" w:lastColumn="0" w:oddVBand="0" w:evenVBand="0" w:oddHBand="1" w:evenHBand="0" w:firstRowFirstColumn="0" w:firstRowLastColumn="0" w:lastRowFirstColumn="0" w:lastRowLastColumn="0"/>
+            </w:pPr>
+            <w:r>
+              <w:t xml:space="preserve">Allows the Participant to view their own event </w:t>
+            </w:r>
+            <w:r>
+              <w:t>enrolments</w:t>
+            </w:r>
+            <w:r>
+              <w:t>.</w:t>
+            </w:r>
+          </w:p>
+        </w:tc>
+        <w:tc>
+          <w:tcPr>
+            <w:tcW w:w="1503" w:type="dxa"/>
+          </w:tcPr>
+          <w:p>
+            <w:pPr>
+              <w:cnfStyle w:val="000000100000" w:firstRow="0" w:lastRow="0" w:firstColumn="0" w:lastColumn="0" w:oddVBand="0" w:evenVBand="0" w:oddHBand="1" w:evenHBand="0" w:firstRowFirstColumn="0" w:firstRowLastColumn="0" w:lastRowFirstColumn="0" w:lastRowLastColumn="0"/>
+            </w:pPr>
+            <w:r>
+              <w:t xml:space="preserve">Allows the Participant to view their own event </w:t>
+            </w:r>
+            <w:r>
+              <w:t>enrolments</w:t>
+            </w:r>
+            <w:r>
+              <w:t>.</w:t>
+            </w:r>
+          </w:p>
+        </w:tc>
+        <w:tc>
+          <w:tcPr>
+            <w:tcW w:w="1503" w:type="dxa"/>
+          </w:tcPr>
+          <w:p>
+            <w:pPr>
+              <w:cnfStyle w:val="000000100000" w:firstRow="0" w:lastRow="0" w:firstColumn="0" w:lastColumn="0" w:oddVBand="0" w:evenVBand="0" w:oddHBand="1" w:evenHBand="0" w:firstRowFirstColumn="0" w:firstRowLastColumn="0" w:lastRowFirstColumn="0" w:lastRowLastColumn="0"/>
+            </w:pPr>
+            <w:r>
+              <w:t>None</w:t>
+            </w:r>
+          </w:p>
+        </w:tc>
+        <w:tc>
+          <w:tcPr>
+            <w:tcW w:w="1503" w:type="dxa"/>
+            <w:shd w:val="clear" w:color="auto" w:fill="EE0000"/>
+          </w:tcPr>
+          <w:p>
+            <w:pPr>
+              <w:cnfStyle w:val="000000100000" w:firstRow="0" w:lastRow="0" w:firstColumn="0" w:lastColumn="0" w:oddVBand="0" w:evenVBand="0" w:oddHBand="1" w:evenHBand="0" w:firstRowFirstColumn="0" w:firstRowLastColumn="0" w:lastRowFirstColumn="0" w:lastRowLastColumn="0"/>
+            </w:pPr>
+            <w:r>
+              <w:rPr>
+                <w:b/>
+                <w:bCs/>
+              </w:rPr>
+              <w:t>200 OK</w:t>
+            </w:r>
+            <w:r>
+              <w:t xml:space="preserve"> – List of available categories.</w:t>
+            </w:r>
+          </w:p>
+        </w:tc>
+      </w:tr>
+      <w:tr>
+        <w:tc>
+          <w:tcPr>
+            <w:cnfStyle w:val="001000000000" w:firstRow="0" w:lastRow="0" w:firstColumn="1" w:lastColumn="0" w:oddVBand="0" w:evenVBand="0" w:oddHBand="0" w:evenHBand="0" w:firstRowFirstColumn="0" w:firstRowLastColumn="0" w:lastRowFirstColumn="0" w:lastRowLastColumn="0"/>
+            <w:tcW w:w="1502" w:type="dxa"/>
+          </w:tcPr>
+          <w:p>
+            <w:r>
+              <w:t>POST</w:t>
+            </w:r>
+          </w:p>
+        </w:tc>
+        <w:tc>
+          <w:tcPr>
+            <w:tcW w:w="1502" w:type="dxa"/>
+          </w:tcPr>
+          <w:p>
+            <w:pPr>
+              <w:jc w:val="center"/>
+              <w:cnfStyle w:val="000000000000" w:firstRow="0" w:lastRow="0" w:firstColumn="0" w:lastColumn="0" w:oddVBand="0" w:evenVBand="0" w:oddHBand="0" w:evenHBand="0" w:firstRowFirstColumn="0" w:firstRowLastColumn="0" w:lastRowFirstColumn="0" w:lastRowLastColumn="0"/>
+            </w:pPr>
+            <w:r>
+              <w:t>/api/</w:t>
+            </w:r>
+            <w:r>
+              <w:t>enrolments</w:t>
+            </w:r>
+          </w:p>
+        </w:tc>
+        <w:tc>
+          <w:tcPr>
+            <w:tcW w:w="1503" w:type="dxa"/>
+          </w:tcPr>
+          <w:tbl>
+            <w:tblPr>
+              <w:tblW w:w="0" w:type="auto"/>
+              <w:tblCellSpacing w:w="15" w:type="dxa"/>
+              <w:tblCellMar>
+                <w:top w:w="15" w:type="dxa"/>
+                <w:left w:w="15" w:type="dxa"/>
+                <w:bottom w:w="15" w:type="dxa"/>
+                <w:right w:w="15" w:type="dxa"/>
+              </w:tblCellMar>
+              <w:tblLook w:val="04A0" w:firstRow="1" w:lastRow="0" w:firstColumn="1" w:lastColumn="0" w:noHBand="0" w:noVBand="1"/>
+            </w:tblPr>
+            <w:tblGrid>
+              <w:gridCol w:w="96"/>
+            </w:tblGrid>
+            <w:tr>
+              <w:trPr>
+                <w:tblCellSpacing w:w="15" w:type="dxa"/>
+              </w:trPr>
+              <w:tc>
+                <w:tcPr>
+                  <w:tcW w:w="0" w:type="auto"/>
+                  <w:vAlign w:val="center"/>
+                  <w:hideMark/>
+                </w:tcPr>
+                <w:p>
+                  <w:pPr>
+                    <w:framePr w:hSpace="180" w:wrap="around" w:vAnchor="page" w:hAnchor="margin" w:y="3097"/>
+                    <w:spacing w:after="0" w:line="240" w:lineRule="auto"/>
+                  </w:pPr>
+                </w:p>
+              </w:tc>
+            </w:tr>
+          </w:tbl>
+          <w:p>
+            <w:pPr>
+              <w:cnfStyle w:val="000000000000" w:firstRow="0" w:lastRow="0" w:firstColumn="0" w:lastColumn="0" w:oddVBand="0" w:evenVBand="0" w:oddHBand="0" w:evenHBand="0" w:firstRowFirstColumn="0" w:firstRowLastColumn="0" w:lastRowFirstColumn="0" w:lastRowLastColumn="0"/>
+              <w:rPr>
+                <w:vanish/>
+              </w:rPr>
+            </w:pPr>
+          </w:p>
+          <w:tbl>
+            <w:tblPr>
+              <w:tblW w:w="0" w:type="auto"/>
+              <w:tblCellSpacing w:w="15" w:type="dxa"/>
+              <w:tblCellMar>
+                <w:top w:w="15" w:type="dxa"/>
+                <w:left w:w="15" w:type="dxa"/>
+                <w:bottom w:w="15" w:type="dxa"/>
+                <w:right w:w="15" w:type="dxa"/>
+              </w:tblCellMar>
+              <w:tblLook w:val="04A0" w:firstRow="1" w:lastRow="0" w:firstColumn="1" w:lastColumn="0" w:noHBand="0" w:noVBand="1"/>
+            </w:tblPr>
+            <w:tblGrid>
+              <w:gridCol w:w="975"/>
+            </w:tblGrid>
+            <w:tr>
+              <w:trPr>
+                <w:tblCellSpacing w:w="15" w:type="dxa"/>
+              </w:trPr>
+              <w:tc>
+                <w:tcPr>
+                  <w:tcW w:w="0" w:type="auto"/>
+                  <w:vAlign w:val="center"/>
+                  <w:hideMark/>
+                </w:tcPr>
+                <w:p>
+                  <w:pPr>
+                    <w:framePr w:hSpace="180" w:wrap="around" w:vAnchor="page" w:hAnchor="margin" w:y="3097"/>
+                    <w:spacing w:after="0" w:line="240" w:lineRule="auto"/>
+                  </w:pPr>
+                  <w:r>
+                    <w:t>Enrols the Participant in a selected event category.</w:t>
+                  </w:r>
+                </w:p>
+              </w:tc>
+            </w:tr>
+          </w:tbl>
+          <w:p>
+            <w:pPr>
+              <w:cnfStyle w:val="000000000000" w:firstRow="0" w:lastRow="0" w:firstColumn="0" w:lastColumn="0" w:oddVBand="0" w:evenVBand="0" w:oddHBand="0" w:evenHBand="0" w:firstRowFirstColumn="0" w:firstRowLastColumn="0" w:lastRowFirstColumn="0" w:lastRowLastColumn="0"/>
+            </w:pPr>
+          </w:p>
+        </w:tc>
+        <w:tc>
+          <w:tcPr>
+            <w:tcW w:w="1503" w:type="dxa"/>
+          </w:tcPr>
+          <w:p>
+            <w:pPr>
+              <w:cnfStyle w:val="000000000000" w:firstRow="0" w:lastRow="0" w:firstColumn="0" w:lastColumn="0" w:oddVBand="0" w:evenVBand="0" w:oddHBand="0" w:evenHBand="0" w:firstRowFirstColumn="0" w:firstRowLastColumn="0" w:lastRowFirstColumn="0" w:lastRowLastColumn="0"/>
+            </w:pPr>
+            <w:r>
+              <w:t>Participant</w:t>
+            </w:r>
+          </w:p>
+        </w:tc>
+        <w:tc>
+          <w:tcPr>
+            <w:tcW w:w="1503" w:type="dxa"/>
+          </w:tcPr>
+          <w:p>
+            <w:pPr>
+              <w:jc w:val="center"/>
+              <w:cnfStyle w:val="000000000000" w:firstRow="0" w:lastRow="0" w:firstColumn="0" w:lastColumn="0" w:oddVBand="0" w:evenVBand="0" w:oddHBand="0" w:evenHBand="0" w:firstRowFirstColumn="0" w:firstRowLastColumn="0" w:lastRowFirstColumn="0" w:lastRowLastColumn="0"/>
+            </w:pPr>
+            <w:r>
+              <w:t>{“</w:t>
+            </w:r>
+            <w:r>
+              <w:t>eventCategoryId</w:t>
+            </w:r>
+            <w:r>
+              <w:t>”}</w:t>
+            </w:r>
+          </w:p>
+        </w:tc>
+        <w:tc>
+          <w:tcPr>
+            <w:tcW w:w="1503" w:type="dxa"/>
+          </w:tcPr>
+          <w:tbl>
+            <w:tblPr>
+              <w:tblW w:w="0" w:type="auto"/>
+              <w:tblCellSpacing w:w="15" w:type="dxa"/>
+              <w:tblCellMar>
+                <w:top w:w="15" w:type="dxa"/>
+                <w:left w:w="15" w:type="dxa"/>
+                <w:bottom w:w="15" w:type="dxa"/>
+                <w:right w:w="15" w:type="dxa"/>
+              </w:tblCellMar>
+              <w:tblLook w:val="04A0" w:firstRow="1" w:lastRow="0" w:firstColumn="1" w:lastColumn="0" w:noHBand="0" w:noVBand="1"/>
+            </w:tblPr>
+            <w:tblGrid>
+              <w:gridCol w:w="96"/>
+            </w:tblGrid>
+            <w:tr>
+              <w:trPr>
+                <w:tblCellSpacing w:w="15" w:type="dxa"/>
+              </w:trPr>
+              <w:tc>
+                <w:tcPr>
+                  <w:tcW w:w="0" w:type="auto"/>
+                  <w:vAlign w:val="center"/>
+                  <w:hideMark/>
+                </w:tcPr>
+                <w:p>
+                  <w:pPr>
+                    <w:framePr w:hSpace="180" w:wrap="around" w:vAnchor="page" w:hAnchor="margin" w:y="3097"/>
+                    <w:spacing w:after="0" w:line="240" w:lineRule="auto"/>
+                  </w:pPr>
+                </w:p>
+              </w:tc>
+            </w:tr>
+            <w:tr>
+              <w:trPr>
+                <w:tblCellSpacing w:w="15" w:type="dxa"/>
+              </w:trPr>
+              <w:tc>
+                <w:tcPr>
+                  <w:tcW w:w="0" w:type="auto"/>
+                  <w:vAlign w:val="center"/>
+                  <w:hideMark/>
+                </w:tcPr>
+                <w:p>
+                  <w:pPr>
+                    <w:framePr w:hSpace="180" w:wrap="around" w:vAnchor="page" w:hAnchor="margin" w:y="3097"/>
+                  </w:pPr>
+                </w:p>
+              </w:tc>
+            </w:tr>
+          </w:tbl>
+          <w:p>
+            <w:pPr>
+              <w:spacing w:after="160" w:line="278" w:lineRule="auto"/>
+              <w:cnfStyle w:val="000000000000" w:firstRow="0" w:lastRow="0" w:firstColumn="0" w:lastColumn="0" w:oddVBand="0" w:evenVBand="0" w:oddHBand="0" w:evenHBand="0" w:firstRowFirstColumn="0" w:firstRowLastColumn="0" w:lastRowFirstColumn="0" w:lastRowLastColumn="0"/>
+              <w:rPr>
+                <w:vanish/>
+              </w:rPr>
+            </w:pPr>
+          </w:p>
+          <w:tbl>
+            <w:tblPr>
+              <w:tblW w:w="0" w:type="auto"/>
+              <w:tblCellSpacing w:w="15" w:type="dxa"/>
+              <w:tblCellMar>
+                <w:top w:w="15" w:type="dxa"/>
+                <w:left w:w="15" w:type="dxa"/>
+                <w:bottom w:w="15" w:type="dxa"/>
+                <w:right w:w="15" w:type="dxa"/>
+              </w:tblCellMar>
+              <w:tblLook w:val="04A0" w:firstRow="1" w:lastRow="0" w:firstColumn="1" w:lastColumn="0" w:noHBand="0" w:noVBand="1"/>
+            </w:tblPr>
+            <w:tblGrid>
+              <w:gridCol w:w="1213"/>
+            </w:tblGrid>
+            <w:tr>
+              <w:trPr>
+                <w:tblCellSpacing w:w="15" w:type="dxa"/>
+              </w:trPr>
+              <w:tc>
+                <w:tcPr>
+                  <w:tcW w:w="0" w:type="auto"/>
+                  <w:vAlign w:val="center"/>
+                  <w:hideMark/>
+                </w:tcPr>
+                <w:p>
+                  <w:pPr>
+                    <w:framePr w:hSpace="180" w:wrap="around" w:vAnchor="page" w:hAnchor="margin" w:y="3097"/>
+                  </w:pPr>
+                  <w:r>
+                    <w:rPr>
+                      <w:b/>
+                      <w:bCs/>
+                    </w:rPr>
+                    <w:t>201 Created</w:t>
+                  </w:r>
+                  <w:r>
+                    <w:t xml:space="preserve"> – </w:t>
+                  </w:r>
+                  <w:r>
+                    <w:t>Enrolment</w:t>
+                  </w:r>
+                  <w:r>
+                    <w:t xml:space="preserve"> created. </w:t>
+                  </w:r>
+                  <w:r>
+                    <w:rPr>
+                      <w:b/>
+                      <w:bCs/>
+                    </w:rPr>
+                    <w:t>409 Conflict</w:t>
+                  </w:r>
+                  <w:r>
+                    <w:t xml:space="preserve"> – Already enrolled/full.</w:t>
+                  </w:r>
+                </w:p>
+              </w:tc>
+            </w:tr>
+          </w:tbl>
+          <w:p>
+            <w:pPr>
+              <w:cnfStyle w:val="000000000000" w:firstRow="0" w:lastRow="0" w:firstColumn="0" w:lastColumn="0" w:oddVBand="0" w:evenVBand="0" w:oddHBand="0" w:evenHBand="0" w:firstRowFirstColumn="0" w:firstRowLastColumn="0" w:lastRowFirstColumn="0" w:lastRowLastColumn="0"/>
+              <w:rPr>
+                <w:vanish/>
+              </w:rPr>
+            </w:pPr>
+          </w:p>
+          <w:tbl>
+            <w:tblPr>
+              <w:tblW w:w="0" w:type="auto"/>
+              <w:tblCellSpacing w:w="15" w:type="dxa"/>
+              <w:tblCellMar>
+                <w:top w:w="15" w:type="dxa"/>
+                <w:left w:w="15" w:type="dxa"/>
+                <w:bottom w:w="15" w:type="dxa"/>
+                <w:right w:w="15" w:type="dxa"/>
+              </w:tblCellMar>
+              <w:tblLook w:val="04A0" w:firstRow="1" w:lastRow="0" w:firstColumn="1" w:lastColumn="0" w:noHBand="0" w:noVBand="1"/>
+            </w:tblPr>
+            <w:tblGrid>
+              <w:gridCol w:w="96"/>
+            </w:tblGrid>
+            <w:tr>
+              <w:trPr>
+                <w:tblCellSpacing w:w="15" w:type="dxa"/>
+              </w:trPr>
+              <w:tc>
+                <w:tcPr>
+                  <w:tcW w:w="0" w:type="auto"/>
+                  <w:vAlign w:val="center"/>
+                  <w:hideMark/>
+                </w:tcPr>
+                <w:p>
+                  <w:pPr>
+                    <w:framePr w:hSpace="180" w:wrap="around" w:vAnchor="page" w:hAnchor="margin" w:y="3097"/>
+                    <w:spacing w:after="0" w:line="240" w:lineRule="auto"/>
+                  </w:pPr>
+                </w:p>
+              </w:tc>
+            </w:tr>
+          </w:tbl>
+          <w:p>
+            <w:pPr>
+              <w:cnfStyle w:val="000000000000" w:firstRow="0" w:lastRow="0" w:firstColumn="0" w:lastColumn="0" w:oddVBand="0" w:evenVBand="0" w:oddHBand="0" w:evenHBand="0" w:firstRowFirstColumn="0" w:firstRowLastColumn="0" w:lastRowFirstColumn="0" w:lastRowLastColumn="0"/>
+            </w:pPr>
+          </w:p>
+        </w:tc>
+      </w:tr>
+      <w:tr>
+        <w:trPr>
+          <w:cnfStyle w:val="000000100000" w:firstRow="0" w:lastRow="0" w:firstColumn="0" w:lastColumn="0" w:oddVBand="0" w:evenVBand="0" w:oddHBand="1" w:evenHBand="0" w:firstRowFirstColumn="0" w:firstRowLastColumn="0" w:lastRowFirstColumn="0" w:lastRowLastColumn="0"/>
+        </w:trPr>
+        <w:tc>
+          <w:tcPr>
+            <w:cnfStyle w:val="001000000000" w:firstRow="0" w:lastRow="0" w:firstColumn="1" w:lastColumn="0" w:oddVBand="0" w:evenVBand="0" w:oddHBand="0" w:evenHBand="0" w:firstRowFirstColumn="0" w:firstRowLastColumn="0" w:lastRowFirstColumn="0" w:lastRowLastColumn="0"/>
+            <w:tcW w:w="1502" w:type="dxa"/>
+          </w:tcPr>
+          <w:p>
+            <w:r>
+              <w:lastRenderedPageBreak/>
+              <w:t>GET</w:t>
+            </w:r>
+          </w:p>
+        </w:tc>
+        <w:tc>
+          <w:tcPr>
+            <w:tcW w:w="1502" w:type="dxa"/>
+          </w:tcPr>
+          <w:tbl>
+            <w:tblPr>
+              <w:tblW w:w="0" w:type="auto"/>
+              <w:tblCellSpacing w:w="15" w:type="dxa"/>
+              <w:tblCellMar>
+                <w:top w:w="15" w:type="dxa"/>
+                <w:left w:w="15" w:type="dxa"/>
+                <w:bottom w:w="15" w:type="dxa"/>
+                <w:right w:w="15" w:type="dxa"/>
+              </w:tblCellMar>
+              <w:tblLook w:val="04A0" w:firstRow="1" w:lastRow="0" w:firstColumn="1" w:lastColumn="0" w:noHBand="0" w:noVBand="1"/>
+            </w:tblPr>
+            <w:tblGrid>
+              <w:gridCol w:w="96"/>
+            </w:tblGrid>
+            <w:tr>
+              <w:trPr>
+                <w:tblCellSpacing w:w="15" w:type="dxa"/>
+              </w:trPr>
+              <w:tc>
+                <w:tcPr>
+                  <w:tcW w:w="0" w:type="auto"/>
+                  <w:vAlign w:val="center"/>
+                  <w:hideMark/>
+                </w:tcPr>
+                <w:p>
+                  <w:pPr>
+                    <w:framePr w:hSpace="180" w:wrap="around" w:vAnchor="page" w:hAnchor="margin" w:y="3097"/>
+                    <w:spacing w:after="0" w:line="240" w:lineRule="auto"/>
+                    <w:jc w:val="center"/>
+                  </w:pPr>
+                </w:p>
+              </w:tc>
+            </w:tr>
+          </w:tbl>
+          <w:p>
+            <w:pPr>
+              <w:jc w:val="center"/>
+              <w:cnfStyle w:val="000000100000" w:firstRow="0" w:lastRow="0" w:firstColumn="0" w:lastColumn="0" w:oddVBand="0" w:evenVBand="0" w:oddHBand="1" w:evenHBand="0" w:firstRowFirstColumn="0" w:firstRowLastColumn="0" w:lastRowFirstColumn="0" w:lastRowLastColumn="0"/>
+              <w:rPr>
+                <w:vanish/>
+              </w:rPr>
+            </w:pPr>
+          </w:p>
+          <w:tbl>
+            <w:tblPr>
+              <w:tblW w:w="0" w:type="auto"/>
+              <w:tblCellSpacing w:w="15" w:type="dxa"/>
+              <w:tblCellMar>
+                <w:top w:w="15" w:type="dxa"/>
+                <w:left w:w="15" w:type="dxa"/>
+                <w:bottom w:w="15" w:type="dxa"/>
+                <w:right w:w="15" w:type="dxa"/>
+              </w:tblCellMar>
+              <w:tblLook w:val="04A0" w:firstRow="1" w:lastRow="0" w:firstColumn="1" w:lastColumn="0" w:noHBand="0" w:noVBand="1"/>
+            </w:tblPr>
+            <w:tblGrid>
+              <w:gridCol w:w="1653"/>
+            </w:tblGrid>
+            <w:tr>
+              <w:trPr>
+                <w:tblCellSpacing w:w="15" w:type="dxa"/>
+              </w:trPr>
+              <w:tc>
+                <w:tcPr>
+                  <w:tcW w:w="0" w:type="auto"/>
+                  <w:vAlign w:val="center"/>
+                  <w:hideMark/>
+                </w:tcPr>
+                <w:p>
+                  <w:pPr>
+                    <w:framePr w:hSpace="180" w:wrap="around" w:vAnchor="page" w:hAnchor="margin" w:y="3097"/>
+                    <w:spacing w:after="0" w:line="240" w:lineRule="auto"/>
+                    <w:jc w:val="center"/>
+                  </w:pPr>
+                  <w:r>
+                    <w:t>/api/</w:t>
+                  </w:r>
+                  <w:r>
+                    <w:t>enrolments</w:t>
+                  </w:r>
+                  <w:r>
+                    <w:t>/my</w:t>
+                  </w:r>
+                </w:p>
+              </w:tc>
+            </w:tr>
+          </w:tbl>
+          <w:p>
+            <w:pPr>
+              <w:jc w:val="center"/>
+              <w:cnfStyle w:val="000000100000" w:firstRow="0" w:lastRow="0" w:firstColumn="0" w:lastColumn="0" w:oddVBand="0" w:evenVBand="0" w:oddHBand="1" w:evenHBand="0" w:firstRowFirstColumn="0" w:firstRowLastColumn="0" w:lastRowFirstColumn="0" w:lastRowLastColumn="0"/>
+            </w:pPr>
+          </w:p>
+        </w:tc>
+        <w:tc>
+          <w:tcPr>
+            <w:tcW w:w="1503" w:type="dxa"/>
+          </w:tcPr>
+          <w:p>
+            <w:pPr>
+              <w:cnfStyle w:val="000000100000" w:firstRow="0" w:lastRow="0" w:firstColumn="0" w:lastColumn="0" w:oddVBand="0" w:evenVBand="0" w:oddHBand="1" w:evenHBand="0" w:firstRowFirstColumn="0" w:firstRowLastColumn="0" w:lastRowFirstColumn="0" w:lastRowLastColumn="0"/>
+            </w:pPr>
+            <w:r>
+              <w:t>Allows the Participant to view their own</w:t>
+            </w:r>
+          </w:p>
+        </w:tc>
+        <w:tc>
+          <w:tcPr>
+            <w:tcW w:w="1503" w:type="dxa"/>
+          </w:tcPr>
+          <w:p>
+            <w:pPr>
+              <w:cnfStyle w:val="000000100000" w:firstRow="0" w:lastRow="0" w:firstColumn="0" w:lastColumn="0" w:oddVBand="0" w:evenVBand="0" w:oddHBand="1" w:evenHBand="0" w:firstRowFirstColumn="0" w:firstRowLastColumn="0" w:lastRowFirstColumn="0" w:lastRowLastColumn="0"/>
+            </w:pPr>
+            <w:r>
+              <w:t>Participant</w:t>
+            </w:r>
+          </w:p>
+        </w:tc>
+        <w:tc>
+          <w:tcPr>
+            <w:tcW w:w="1503" w:type="dxa"/>
+          </w:tcPr>
+          <w:p>
+            <w:pPr>
+              <w:cnfStyle w:val="000000100000" w:firstRow="0" w:lastRow="0" w:firstColumn="0" w:lastColumn="0" w:oddVBand="0" w:evenVBand="0" w:oddHBand="1" w:evenHBand="0" w:firstRowFirstColumn="0" w:firstRowLastColumn="0" w:lastRowFirstColumn="0" w:lastRowLastColumn="0"/>
+            </w:pPr>
+            <w:r>
+              <w:t>None</w:t>
+            </w:r>
+          </w:p>
+        </w:tc>
+        <w:tc>
+          <w:tcPr>
+            <w:tcW w:w="1503" w:type="dxa"/>
+          </w:tcPr>
+          <w:p>
+            <w:pPr>
+              <w:cnfStyle w:val="000000100000" w:firstRow="0" w:lastRow="0" w:firstColumn="0" w:lastColumn="0" w:oddVBand="0" w:evenVBand="0" w:oddHBand="1" w:evenHBand="0" w:firstRowFirstColumn="0" w:firstRowLastColumn="0" w:lastRowFirstColumn="0" w:lastRowLastColumn="0"/>
+            </w:pPr>
+            <w:r>
+              <w:rPr>
+                <w:b/>
+                <w:bCs/>
+              </w:rPr>
+              <w:t>200 OK</w:t>
+            </w:r>
+            <w:r>
+              <w:t xml:space="preserve"> – </w:t>
+            </w:r>
+            <w:r>
+              <w:t>Enrolment</w:t>
+            </w:r>
+            <w:r>
+              <w:t xml:space="preserve"> details. </w:t>
+            </w:r>
+            <w:r>
+              <w:rPr>
+                <w:b/>
+                <w:bCs/>
+              </w:rPr>
+              <w:t>403 Forbidden</w:t>
+            </w:r>
+            <w:r>
+              <w:t xml:space="preserve"> – </w:t>
+            </w:r>
+            <w:r>
+              <w:t>Enrolment</w:t>
+            </w:r>
+            <w:r>
+              <w:t xml:space="preserve"> belongs to another participant.</w:t>
+            </w:r>
+          </w:p>
+        </w:tc>
+      </w:tr>
+      <w:tr>
+        <w:tc>
+          <w:tcPr>
+            <w:cnfStyle w:val="001000000000" w:firstRow="0" w:lastRow="0" w:firstColumn="1" w:lastColumn="0" w:oddVBand="0" w:evenVBand="0" w:oddHBand="0" w:evenHBand="0" w:firstRowFirstColumn="0" w:firstRowLastColumn="0" w:lastRowFirstColumn="0" w:lastRowLastColumn="0"/>
+            <w:tcW w:w="1502" w:type="dxa"/>
+          </w:tcPr>
+          <w:p>
+            <w:r>
+              <w:t>GET</w:t>
+            </w:r>
+          </w:p>
+        </w:tc>
+        <w:tc>
+          <w:tcPr>
+            <w:tcW w:w="1502" w:type="dxa"/>
+          </w:tcPr>
+          <w:tbl>
+            <w:tblPr>
+              <w:tblW w:w="0" w:type="auto"/>
+              <w:tblCellSpacing w:w="15" w:type="dxa"/>
+              <w:tblCellMar>
+                <w:top w:w="15" w:type="dxa"/>
+                <w:left w:w="15" w:type="dxa"/>
+                <w:bottom w:w="15" w:type="dxa"/>
+                <w:right w:w="15" w:type="dxa"/>
+              </w:tblCellMar>
+              <w:tblLook w:val="04A0" w:firstRow="1" w:lastRow="0" w:firstColumn="1" w:lastColumn="0" w:noHBand="0" w:noVBand="1"/>
+            </w:tblPr>
+            <w:tblGrid>
+              <w:gridCol w:w="96"/>
+            </w:tblGrid>
+            <w:tr>
+              <w:trPr>
+                <w:tblCellSpacing w:w="15" w:type="dxa"/>
+              </w:trPr>
+              <w:tc>
+                <w:tcPr>
+                  <w:tcW w:w="0" w:type="auto"/>
+                  <w:vAlign w:val="center"/>
+                  <w:hideMark/>
+                </w:tcPr>
+                <w:p>
+                  <w:pPr>
+                    <w:framePr w:hSpace="180" w:wrap="around" w:vAnchor="page" w:hAnchor="margin" w:y="3097"/>
+                    <w:spacing w:after="0" w:line="240" w:lineRule="auto"/>
+                  </w:pPr>
+                </w:p>
+              </w:tc>
+            </w:tr>
+          </w:tbl>
+          <w:p>
+            <w:pPr>
+              <w:cnfStyle w:val="000000000000" w:firstRow="0" w:lastRow="0" w:firstColumn="0" w:lastColumn="0" w:oddVBand="0" w:evenVBand="0" w:oddHBand="0" w:evenHBand="0" w:firstRowFirstColumn="0" w:firstRowLastColumn="0" w:lastRowFirstColumn="0" w:lastRowLastColumn="0"/>
+              <w:rPr>
+                <w:vanish/>
+              </w:rPr>
+            </w:pPr>
+          </w:p>
+          <w:tbl>
+            <w:tblPr>
+              <w:tblW w:w="0" w:type="auto"/>
+              <w:tblCellSpacing w:w="15" w:type="dxa"/>
+              <w:tblCellMar>
+                <w:top w:w="15" w:type="dxa"/>
+                <w:left w:w="15" w:type="dxa"/>
+                <w:bottom w:w="15" w:type="dxa"/>
+                <w:right w:w="15" w:type="dxa"/>
+              </w:tblCellMar>
+              <w:tblLook w:val="04A0" w:firstRow="1" w:lastRow="0" w:firstColumn="1" w:lastColumn="0" w:noHBand="0" w:noVBand="1"/>
+            </w:tblPr>
+            <w:tblGrid>
+              <w:gridCol w:w="1653"/>
+            </w:tblGrid>
+            <w:tr>
+              <w:trPr>
+                <w:tblCellSpacing w:w="15" w:type="dxa"/>
+              </w:trPr>
+              <w:tc>
+                <w:tcPr>
+                  <w:tcW w:w="0" w:type="auto"/>
+                  <w:vAlign w:val="center"/>
+                  <w:hideMark/>
+                </w:tcPr>
+                <w:p>
+                  <w:pPr>
+                    <w:framePr w:hSpace="180" w:wrap="around" w:vAnchor="page" w:hAnchor="margin" w:y="3097"/>
+                    <w:spacing w:after="0" w:line="240" w:lineRule="auto"/>
+                  </w:pPr>
+                  <w:r>
+                    <w:t>/</w:t>
+                  </w:r>
+                  <w:proofErr w:type="gramStart"/>
+                  <w:r>
+                    <w:t>api</w:t>
+                  </w:r>
+                  <w:proofErr w:type="gramEnd"/>
+                  <w:r>
+                    <w:t>/</w:t>
+                  </w:r>
+                  <w:r>
+                    <w:t>enrolments</w:t>
+                  </w:r>
+                  <w:r>
+                    <w:t>/{id}</w:t>
+                  </w:r>
+                </w:p>
+              </w:tc>
+            </w:tr>
+          </w:tbl>
+          <w:p>
+            <w:pPr>
+              <w:cnfStyle w:val="000000000000" w:firstRow="0" w:lastRow="0" w:firstColumn="0" w:lastColumn="0" w:oddVBand="0" w:evenVBand="0" w:oddHBand="0" w:evenHBand="0" w:firstRowFirstColumn="0" w:firstRowLastColumn="0" w:lastRowFirstColumn="0" w:lastRowLastColumn="0"/>
+            </w:pPr>
+          </w:p>
+        </w:tc>
+        <w:tc>
+          <w:tcPr>
+            <w:tcW w:w="1503" w:type="dxa"/>
+          </w:tcPr>
+          <w:p>
+            <w:pPr>
+              <w:cnfStyle w:val="000000000000" w:firstRow="0" w:lastRow="0" w:firstColumn="0" w:lastColumn="0" w:oddVBand="0" w:evenVBand="0" w:oddHBand="0" w:evenHBand="0" w:firstRowFirstColumn="0" w:firstRowLastColumn="0" w:lastRowFirstColumn="0" w:lastRowLastColumn="0"/>
+            </w:pPr>
+            <w:r>
+              <w:t xml:space="preserve">Allows the Participant to cancel their own </w:t>
+            </w:r>
+            <w:r>
+              <w:t>enrolment</w:t>
+            </w:r>
+            <w:r>
+              <w:t>.</w:t>
+            </w:r>
+          </w:p>
+        </w:tc>
+        <w:tc>
+          <w:tcPr>
+            <w:tcW w:w="1503" w:type="dxa"/>
+          </w:tcPr>
+          <w:p>
+            <w:pPr>
+              <w:cnfStyle w:val="000000000000" w:firstRow="0" w:lastRow="0" w:firstColumn="0" w:lastColumn="0" w:oddVBand="0" w:evenVBand="0" w:oddHBand="0" w:evenHBand="0" w:firstRowFirstColumn="0" w:firstRowLastColumn="0" w:lastRowFirstColumn="0" w:lastRowLastColumn="0"/>
+            </w:pPr>
+            <w:r>
+              <w:t>Participant</w:t>
+            </w:r>
+          </w:p>
+        </w:tc>
+        <w:tc>
+          <w:tcPr>
+            <w:tcW w:w="1503" w:type="dxa"/>
+          </w:tcPr>
+          <w:p>
+            <w:pPr>
+              <w:cnfStyle w:val="000000000000" w:firstRow="0" w:lastRow="0" w:firstColumn="0" w:lastColumn="0" w:oddVBand="0" w:evenVBand="0" w:oddHBand="0" w:evenHBand="0" w:firstRowFirstColumn="0" w:firstRowLastColumn="0" w:lastRowFirstColumn="0" w:lastRowLastColumn="0"/>
+            </w:pPr>
+            <w:r>
+              <w:t>None</w:t>
+            </w:r>
+          </w:p>
+        </w:tc>
+        <w:tc>
+          <w:tcPr>
+            <w:tcW w:w="1503" w:type="dxa"/>
+          </w:tcPr>
+          <w:p>
+            <w:pPr>
+              <w:cnfStyle w:val="000000000000" w:firstRow="0" w:lastRow="0" w:firstColumn="0" w:lastColumn="0" w:oddVBand="0" w:evenVBand="0" w:oddHBand="0" w:evenHBand="0" w:firstRowFirstColumn="0" w:firstRowLastColumn="0" w:lastRowFirstColumn="0" w:lastRowLastColumn="0"/>
+            </w:pPr>
+            <w:r>
+              <w:rPr>
+                <w:b/>
+                <w:bCs/>
+              </w:rPr>
+              <w:t>204 No Content</w:t>
+            </w:r>
+            <w:r>
+              <w:t xml:space="preserve"> – </w:t>
+            </w:r>
+            <w:r>
+              <w:t>Enrolment</w:t>
+            </w:r>
+            <w:r>
+              <w:t xml:space="preserve"> cancelled. </w:t>
+            </w:r>
+            <w:r>
+              <w:rPr>
+                <w:b/>
+                <w:bCs/>
+              </w:rPr>
+              <w:t>403 Forbidden</w:t>
+            </w:r>
+            <w:r>
+              <w:t xml:space="preserve"> – Not authorised.</w:t>
+            </w:r>
+          </w:p>
+        </w:tc>
+      </w:tr>
+      <w:tr>
+        <w:trPr>
+          <w:cnfStyle w:val="000000100000" w:firstRow="0" w:lastRow="0" w:firstColumn="0" w:lastColumn="0" w:oddVBand="0" w:evenVBand="0" w:oddHBand="1" w:evenHBand="0" w:firstRowFirstColumn="0" w:firstRowLastColumn="0" w:lastRowFirstColumn="0" w:lastRowLastColumn="0"/>
+        </w:trPr>
+        <w:tc>
+          <w:tcPr>
+            <w:cnfStyle w:val="001000000000" w:firstRow="0" w:lastRow="0" w:firstColumn="1" w:lastColumn="0" w:oddVBand="0" w:evenVBand="0" w:oddHBand="0" w:evenHBand="0" w:firstRowFirstColumn="0" w:firstRowLastColumn="0" w:lastRowFirstColumn="0" w:lastRowLastColumn="0"/>
+            <w:tcW w:w="1502" w:type="dxa"/>
+          </w:tcPr>
+          <w:p>
+            <w:r>
+              <w:t>DELETE</w:t>
+            </w:r>
+          </w:p>
+        </w:tc>
+        <w:tc>
+          <w:tcPr>
+            <w:tcW w:w="1502" w:type="dxa"/>
+          </w:tcPr>
+          <w:tbl>
+            <w:tblPr>
+              <w:tblW w:w="0" w:type="auto"/>
+              <w:tblCellSpacing w:w="15" w:type="dxa"/>
+              <w:tblCellMar>
+                <w:top w:w="15" w:type="dxa"/>
+                <w:left w:w="15" w:type="dxa"/>
+                <w:bottom w:w="15" w:type="dxa"/>
+                <w:right w:w="15" w:type="dxa"/>
+              </w:tblCellMar>
+              <w:tblLook w:val="04A0" w:firstRow="1" w:lastRow="0" w:firstColumn="1" w:lastColumn="0" w:noHBand="0" w:noVBand="1"/>
+            </w:tblPr>
+            <w:tblGrid>
+              <w:gridCol w:w="96"/>
+            </w:tblGrid>
+            <w:tr>
+              <w:trPr>
+                <w:tblCellSpacing w:w="15" w:type="dxa"/>
+              </w:trPr>
+              <w:tc>
+                <w:tcPr>
+                  <w:tcW w:w="0" w:type="auto"/>
+                  <w:vAlign w:val="center"/>
+                  <w:hideMark/>
+                </w:tcPr>
+                <w:p>
+                  <w:pPr>
+                    <w:framePr w:hSpace="180" w:wrap="around" w:vAnchor="page" w:hAnchor="margin" w:y="3097"/>
+                    <w:spacing w:after="0" w:line="240" w:lineRule="auto"/>
+                    <w:jc w:val="center"/>
+                  </w:pPr>
+                </w:p>
+              </w:tc>
+            </w:tr>
+          </w:tbl>
+          <w:p>
+            <w:pPr>
+              <w:jc w:val="center"/>
+              <w:cnfStyle w:val="000000100000" w:firstRow="0" w:lastRow="0" w:firstColumn="0" w:lastColumn="0" w:oddVBand="0" w:evenVBand="0" w:oddHBand="1" w:evenHBand="0" w:firstRowFirstColumn="0" w:firstRowLastColumn="0" w:lastRowFirstColumn="0" w:lastRowLastColumn="0"/>
+              <w:rPr>
+                <w:vanish/>
+              </w:rPr>
+            </w:pPr>
+          </w:p>
+          <w:tbl>
+            <w:tblPr>
+              <w:tblW w:w="0" w:type="auto"/>
+              <w:tblCellSpacing w:w="15" w:type="dxa"/>
+              <w:tblCellMar>
+                <w:top w:w="15" w:type="dxa"/>
+                <w:left w:w="15" w:type="dxa"/>
+                <w:bottom w:w="15" w:type="dxa"/>
+                <w:right w:w="15" w:type="dxa"/>
+              </w:tblCellMar>
+              <w:tblLook w:val="04A0" w:firstRow="1" w:lastRow="0" w:firstColumn="1" w:lastColumn="0" w:noHBand="0" w:noVBand="1"/>
+            </w:tblPr>
+            <w:tblGrid>
+              <w:gridCol w:w="1653"/>
+            </w:tblGrid>
+            <w:tr>
+              <w:trPr>
+                <w:tblCellSpacing w:w="15" w:type="dxa"/>
+              </w:trPr>
+              <w:tc>
+                <w:tcPr>
+                  <w:tcW w:w="0" w:type="auto"/>
+                  <w:vAlign w:val="center"/>
+                  <w:hideMark/>
+                </w:tcPr>
+                <w:p>
+                  <w:pPr>
+                    <w:framePr w:hSpace="180" w:wrap="around" w:vAnchor="page" w:hAnchor="margin" w:y="3097"/>
+                    <w:spacing w:after="0" w:line="240" w:lineRule="auto"/>
+                    <w:jc w:val="center"/>
+                  </w:pPr>
+                  <w:r>
+                    <w:t>/</w:t>
+                  </w:r>
+                  <w:proofErr w:type="gramStart"/>
+                  <w:r>
+                    <w:t>api</w:t>
+                  </w:r>
+                  <w:proofErr w:type="gramEnd"/>
+                  <w:r>
+                    <w:t>/</w:t>
+                  </w:r>
+                  <w:r>
+                    <w:t>enrolments</w:t>
+                  </w:r>
+                  <w:r>
+                    <w:t>/{id}</w:t>
+                  </w:r>
+                </w:p>
+              </w:tc>
+            </w:tr>
+          </w:tbl>
+          <w:p>
+            <w:pPr>
+              <w:jc w:val="center"/>
+              <w:cnfStyle w:val="000000100000" w:firstRow="0" w:lastRow="0" w:firstColumn="0" w:lastColumn="0" w:oddVBand="0" w:evenVBand="0" w:oddHBand="1" w:evenHBand="0" w:firstRowFirstColumn="0" w:firstRowLastColumn="0" w:lastRowFirstColumn="0" w:lastRowLastColumn="0"/>
+            </w:pPr>
+          </w:p>
+        </w:tc>
+        <w:tc>
+          <w:tcPr>
+            <w:tcW w:w="1503" w:type="dxa"/>
+          </w:tcPr>
+          <w:p>
+            <w:pPr>
+              <w:tabs>
+                <w:tab w:val="left" w:pos="732"/>
+              </w:tabs>
+              <w:cnfStyle w:val="000000100000" w:firstRow="0" w:lastRow="0" w:firstColumn="0" w:lastColumn="0" w:oddVBand="0" w:evenVBand="0" w:oddHBand="1" w:evenHBand="0" w:firstRowFirstColumn="0" w:firstRowLastColumn="0" w:lastRowFirstColumn="0" w:lastRowLastColumn="0"/>
+            </w:pPr>
+            <w:r>
+              <w:tab/>
+            </w:r>
+          </w:p>
+          <w:tbl>
+            <w:tblPr>
+              <w:tblW w:w="0" w:type="auto"/>
+              <w:tblCellSpacing w:w="15" w:type="dxa"/>
+              <w:tblCellMar>
+                <w:top w:w="15" w:type="dxa"/>
+                <w:left w:w="15" w:type="dxa"/>
+                <w:bottom w:w="15" w:type="dxa"/>
+                <w:right w:w="15" w:type="dxa"/>
+              </w:tblCellMar>
+              <w:tblLook w:val="04A0" w:firstRow="1" w:lastRow="0" w:firstColumn="1" w:lastColumn="0" w:noHBand="0" w:noVBand="1"/>
+            </w:tblPr>
+            <w:tblGrid>
+              <w:gridCol w:w="96"/>
+            </w:tblGrid>
+            <w:tr>
+              <w:trPr>
+                <w:tblCellSpacing w:w="15" w:type="dxa"/>
+              </w:trPr>
+              <w:tc>
+                <w:tcPr>
+                  <w:tcW w:w="0" w:type="auto"/>
+                  <w:vAlign w:val="center"/>
+                  <w:hideMark/>
+                </w:tcPr>
+                <w:p>
+                  <w:pPr>
+                    <w:framePr w:hSpace="180" w:wrap="around" w:vAnchor="page" w:hAnchor="margin" w:y="3097"/>
+                    <w:tabs>
+                      <w:tab w:val="left" w:pos="732"/>
+                    </w:tabs>
+                    <w:spacing w:after="0" w:line="240" w:lineRule="auto"/>
+                  </w:pPr>
+                </w:p>
+              </w:tc>
+            </w:tr>
+          </w:tbl>
+          <w:p>
+            <w:pPr>
+              <w:tabs>
+                <w:tab w:val="left" w:pos="732"/>
+              </w:tabs>
+              <w:cnfStyle w:val="000000100000" w:firstRow="0" w:lastRow="0" w:firstColumn="0" w:lastColumn="0" w:oddVBand="0" w:evenVBand="0" w:oddHBand="1" w:evenHBand="0" w:firstRowFirstColumn="0" w:firstRowLastColumn="0" w:lastRowFirstColumn="0" w:lastRowLastColumn="0"/>
+              <w:rPr>
+                <w:vanish/>
+              </w:rPr>
+            </w:pPr>
+          </w:p>
+          <w:tbl>
+            <w:tblPr>
+              <w:tblW w:w="0" w:type="auto"/>
+              <w:tblCellSpacing w:w="15" w:type="dxa"/>
+              <w:tblCellMar>
+                <w:top w:w="15" w:type="dxa"/>
+                <w:left w:w="15" w:type="dxa"/>
+                <w:bottom w:w="15" w:type="dxa"/>
+                <w:right w:w="15" w:type="dxa"/>
+              </w:tblCellMar>
+              <w:tblLook w:val="04A0" w:firstRow="1" w:lastRow="0" w:firstColumn="1" w:lastColumn="0" w:noHBand="0" w:noVBand="1"/>
+            </w:tblPr>
+            <w:tblGrid>
+              <w:gridCol w:w="975"/>
+            </w:tblGrid>
+            <w:tr>
+              <w:trPr>
+                <w:tblCellSpacing w:w="15" w:type="dxa"/>
+              </w:trPr>
+              <w:tc>
+                <w:tcPr>
+                  <w:tcW w:w="0" w:type="auto"/>
+                  <w:vAlign w:val="center"/>
+                  <w:hideMark/>
+                </w:tcPr>
+                <w:p>
+                  <w:pPr>
+                    <w:framePr w:hSpace="180" w:wrap="around" w:vAnchor="page" w:hAnchor="margin" w:y="3097"/>
+                    <w:tabs>
+                      <w:tab w:val="left" w:pos="732"/>
+                    </w:tabs>
+                    <w:spacing w:after="0" w:line="240" w:lineRule="auto"/>
+                  </w:pPr>
+                  <w:r>
+                    <w:t>Allows the Participant to view their personal results and</w:t>
+                  </w:r>
+                </w:p>
+              </w:tc>
+            </w:tr>
+          </w:tbl>
+          <w:p>
+            <w:pPr>
+              <w:tabs>
+                <w:tab w:val="left" w:pos="732"/>
+              </w:tabs>
+              <w:cnfStyle w:val="000000100000" w:firstRow="0" w:lastRow="0" w:firstColumn="0" w:lastColumn="0" w:oddVBand="0" w:evenVBand="0" w:oddHBand="1" w:evenHBand="0" w:firstRowFirstColumn="0" w:firstRowLastColumn="0" w:lastRowFirstColumn="0" w:lastRowLastColumn="0"/>
+            </w:pPr>
+          </w:p>
+        </w:tc>
+        <w:tc>
+          <w:tcPr>
+            <w:tcW w:w="1503" w:type="dxa"/>
+          </w:tcPr>
+          <w:p>
+            <w:pPr>
+              <w:cnfStyle w:val="000000100000" w:firstRow="0" w:lastRow="0" w:firstColumn="0" w:lastColumn="0" w:oddVBand="0" w:evenVBand="0" w:oddHBand="1" w:evenHBand="0" w:firstRowFirstColumn="0" w:firstRowLastColumn="0" w:lastRowFirstColumn="0" w:lastRowLastColumn="0"/>
+            </w:pPr>
+            <w:r>
+              <w:t>Participant</w:t>
+            </w:r>
+          </w:p>
+        </w:tc>
+        <w:tc>
+          <w:tcPr>
+            <w:tcW w:w="1503" w:type="dxa"/>
+          </w:tcPr>
+          <w:p>
+            <w:pPr>
+              <w:cnfStyle w:val="000000100000" w:firstRow="0" w:lastRow="0" w:firstColumn="0" w:lastColumn="0" w:oddVBand="0" w:evenVBand="0" w:oddHBand="1" w:evenHBand="0" w:firstRowFirstColumn="0" w:firstRowLastColumn="0" w:lastRowFirstColumn="0" w:lastRowLastColumn="0"/>
+            </w:pPr>
+            <w:r>
+              <w:t>None</w:t>
+            </w:r>
+          </w:p>
+        </w:tc>
+        <w:tc>
+          <w:tcPr>
+            <w:tcW w:w="1503" w:type="dxa"/>
+          </w:tcPr>
+          <w:p>
+            <w:pPr>
+              <w:cnfStyle w:val="000000100000" w:firstRow="0" w:lastRow="0" w:firstColumn="0" w:lastColumn="0" w:oddVBand="0" w:evenVBand="0" w:oddHBand="1" w:evenHBand="0" w:firstRowFirstColumn="0" w:firstRowLastColumn="0" w:lastRowFirstColumn="0" w:lastRowLastColumn="0"/>
+            </w:pPr>
+            <w:r>
+              <w:rPr>
+                <w:b/>
+                <w:bCs/>
+              </w:rPr>
+              <w:t>200 OK</w:t>
+            </w:r>
+            <w:r>
+              <w:t xml:space="preserve"> – List of personal results.</w:t>
+            </w:r>
+          </w:p>
+        </w:tc>
+      </w:tr>
+      <w:tr>
+        <w:trPr>
+          <w:trHeight w:val="284"/>
+        </w:trPr>
+        <w:tc>
+          <w:tcPr>
+            <w:cnfStyle w:val="001000000000" w:firstRow="0" w:lastRow="0" w:firstColumn="1" w:lastColumn="0" w:oddVBand="0" w:evenVBand="0" w:oddHBand="0" w:evenHBand="0" w:firstRowFirstColumn="0" w:firstRowLastColumn="0" w:lastRowFirstColumn="0" w:lastRowLastColumn="0"/>
+            <w:tcW w:w="1502" w:type="dxa"/>
+          </w:tcPr>
+          <w:p>
+            <w:r>
+              <w:t>GET</w:t>
+            </w:r>
+          </w:p>
+        </w:tc>
+        <w:tc>
+          <w:tcPr>
+            <w:tcW w:w="1502" w:type="dxa"/>
+          </w:tcPr>
+          <w:p>
+            <w:pPr>
+              <w:jc w:val="center"/>
+              <w:cnfStyle w:val="000000000000" w:firstRow="0" w:lastRow="0" w:firstColumn="0" w:lastColumn="0" w:oddVBand="0" w:evenVBand="0" w:oddHBand="0" w:evenHBand="0" w:firstRowFirstColumn="0" w:firstRowLastColumn="0" w:lastRowFirstColumn="0" w:lastRowLastColumn="0"/>
+            </w:pPr>
+            <w:r>
+              <w:t>/api/results/my</w:t>
+            </w:r>
+          </w:p>
+        </w:tc>
+        <w:tc>
+          <w:tcPr>
+            <w:tcW w:w="1503" w:type="dxa"/>
+          </w:tcPr>
+          <w:p>
+            <w:pPr>
+              <w:cnfStyle w:val="000000000000" w:firstRow="0" w:lastRow="0" w:firstColumn="0" w:lastColumn="0" w:oddVBand="0" w:evenVBand="0" w:oddHBand="0" w:evenHBand="0" w:firstRowFirstColumn="0" w:firstRowLastColumn="0" w:lastRowFirstColumn="0" w:lastRowLastColumn="0"/>
+            </w:pPr>
+            <w:r>
+              <w:t>Allows the Participant to view one of their results.</w:t>
+            </w:r>
+          </w:p>
+        </w:tc>
+        <w:tc>
+          <w:tcPr>
+            <w:tcW w:w="1503" w:type="dxa"/>
+          </w:tcPr>
+          <w:p>
+            <w:pPr>
+              <w:cnfStyle w:val="000000000000" w:firstRow="0" w:lastRow="0" w:firstColumn="0" w:lastColumn="0" w:oddVBand="0" w:evenVBand="0" w:oddHBand="0" w:evenHBand="0" w:firstRowFirstColumn="0" w:firstRowLastColumn="0" w:lastRowFirstColumn="0" w:lastRowLastColumn="0"/>
+            </w:pPr>
+            <w:r>
+              <w:t>Participant</w:t>
+            </w:r>
+          </w:p>
+        </w:tc>
+        <w:tc>
+          <w:tcPr>
+            <w:tcW w:w="1503" w:type="dxa"/>
+          </w:tcPr>
+          <w:p>
+            <w:pPr>
+              <w:cnfStyle w:val="000000000000" w:firstRow="0" w:lastRow="0" w:firstColumn="0" w:lastColumn="0" w:oddVBand="0" w:evenVBand="0" w:oddHBand="0" w:evenHBand="0" w:firstRowFirstColumn="0" w:firstRowLastColumn="0" w:lastRowFirstColumn="0" w:lastRowLastColumn="0"/>
+            </w:pPr>
+            <w:r>
+              <w:t>None</w:t>
+            </w:r>
+          </w:p>
+        </w:tc>
+        <w:tc>
+          <w:tcPr>
+            <w:tcW w:w="1503" w:type="dxa"/>
+          </w:tcPr>
+          <w:tbl>
+            <w:tblPr>
+              <w:tblW w:w="0" w:type="auto"/>
+              <w:tblCellSpacing w:w="15" w:type="dxa"/>
+              <w:tblCellMar>
+                <w:top w:w="15" w:type="dxa"/>
+                <w:left w:w="15" w:type="dxa"/>
+                <w:bottom w:w="15" w:type="dxa"/>
+                <w:right w:w="15" w:type="dxa"/>
+              </w:tblCellMar>
+              <w:tblLook w:val="04A0" w:firstRow="1" w:lastRow="0" w:firstColumn="1" w:lastColumn="0" w:noHBand="0" w:noVBand="1"/>
+            </w:tblPr>
+            <w:tblGrid>
+              <w:gridCol w:w="96"/>
+            </w:tblGrid>
+            <w:tr>
+              <w:trPr>
+                <w:tblCellSpacing w:w="15" w:type="dxa"/>
+              </w:trPr>
+              <w:tc>
+                <w:tcPr>
+                  <w:tcW w:w="0" w:type="auto"/>
+                  <w:vAlign w:val="center"/>
+                  <w:hideMark/>
+                </w:tcPr>
+                <w:p>
+                  <w:pPr>
+                    <w:framePr w:hSpace="180" w:wrap="around" w:vAnchor="page" w:hAnchor="margin" w:y="3097"/>
+                    <w:spacing w:after="0" w:line="240" w:lineRule="auto"/>
+                  </w:pPr>
+                </w:p>
+              </w:tc>
+            </w:tr>
+          </w:tbl>
+          <w:p>
+            <w:pPr>
+              <w:cnfStyle w:val="000000000000" w:firstRow="0" w:lastRow="0" w:firstColumn="0" w:lastColumn="0" w:oddVBand="0" w:evenVBand="0" w:oddHBand="0" w:evenHBand="0" w:firstRowFirstColumn="0" w:firstRowLastColumn="0" w:lastRowFirstColumn="0" w:lastRowLastColumn="0"/>
+              <w:rPr>
+                <w:vanish/>
+              </w:rPr>
+            </w:pPr>
+          </w:p>
+          <w:tbl>
+            <w:tblPr>
+              <w:tblW w:w="0" w:type="auto"/>
+              <w:tblCellSpacing w:w="15" w:type="dxa"/>
+              <w:tblCellMar>
+                <w:top w:w="15" w:type="dxa"/>
+                <w:left w:w="15" w:type="dxa"/>
+                <w:bottom w:w="15" w:type="dxa"/>
+                <w:right w:w="15" w:type="dxa"/>
+              </w:tblCellMar>
+              <w:tblLook w:val="04A0" w:firstRow="1" w:lastRow="0" w:firstColumn="1" w:lastColumn="0" w:noHBand="0" w:noVBand="1"/>
+            </w:tblPr>
+            <w:tblGrid>
+              <w:gridCol w:w="1213"/>
+            </w:tblGrid>
+            <w:tr>
+              <w:trPr>
+                <w:tblCellSpacing w:w="15" w:type="dxa"/>
+              </w:trPr>
+              <w:tc>
+                <w:tcPr>
+                  <w:tcW w:w="0" w:type="auto"/>
+                  <w:vAlign w:val="center"/>
+                  <w:hideMark/>
+                </w:tcPr>
+                <w:p>
+                  <w:pPr>
+                    <w:framePr w:hSpace="180" w:wrap="around" w:vAnchor="page" w:hAnchor="margin" w:y="3097"/>
+                    <w:spacing w:after="0" w:line="240" w:lineRule="auto"/>
+                  </w:pPr>
+                  <w:r>
+                    <w:rPr>
+                      <w:b/>
+                      <w:bCs/>
+                    </w:rPr>
+                    <w:t>200 OK</w:t>
+                  </w:r>
+                  <w:r>
+                    <w:t xml:space="preserve"> – Result details. </w:t>
+                  </w:r>
+                  <w:r>
+                    <w:rPr>
+                      <w:b/>
+                      <w:bCs/>
+                    </w:rPr>
+                    <w:t>403 Forbidden</w:t>
+                  </w:r>
+                  <w:r>
+                    <w:t xml:space="preserve"> – Not authorised.</w:t>
+                  </w:r>
+                </w:p>
+              </w:tc>
+            </w:tr>
+          </w:tbl>
+          <w:p>
+            <w:pPr>
+              <w:cnfStyle w:val="000000000000" w:firstRow="0" w:lastRow="0" w:firstColumn="0" w:lastColumn="0" w:oddVBand="0" w:evenVBand="0" w:oddHBand="0" w:evenHBand="0" w:firstRowFirstColumn="0" w:firstRowLastColumn="0" w:lastRowFirstColumn="0" w:lastRowLastColumn="0"/>
+            </w:pPr>
+          </w:p>
+        </w:tc>
+      </w:tr>
+    </w:tbl>
     <w:p/>
     <w:sectPr>
-      <w:headerReference w:type="default" r:id="rId7"/>
+      <w:headerReference w:type="even" r:id="rId7"/>
+      <w:headerReference w:type="default" r:id="rId8"/>
+      <w:footerReference w:type="even" r:id="rId9"/>
+      <w:footerReference w:type="default" r:id="rId10"/>
+      <w:headerReference w:type="first" r:id="rId11"/>
+      <w:footerReference w:type="first" r:id="rId12"/>
       <w:pgSz w:w="11906" w:h="16838"/>
       <w:pgMar w:top="1440" w:right="1440" w:bottom="1440" w:left="1440" w:header="708" w:footer="708" w:gutter="0"/>
       <w:cols w:space="708"/>
@@ -3198,6 +5582,36 @@
 </w:endnotes>
 </file>
 
+<file path=word/footer1.xml><?xml version="1.0" encoding="utf-8"?>
+<w:ftr xmlns:wpc="http://schemas.microsoft.com/office/word/2010/wordprocessingCanvas" xmlns:cx="http://schemas.microsoft.com/office/drawing/2014/chartex" xmlns:cx1="http://schemas.microsoft.com/office/drawing/2015/9/8/chartex" xmlns:cx2="http://schemas.microsoft.com/office/drawing/2015/10/21/chartex" xmlns:cx3="http://schemas.microsoft.com/office/drawing/2016/5/9/chartex" xmlns:cx4="http://schemas.microsoft.com/office/drawing/2016/5/10/chartex" xmlns:cx5="http://schemas.microsoft.com/office/drawing/2016/5/11/chartex" xmlns:cx6="http://schemas.microsoft.com/office/drawing/2016/5/12/chartex" xmlns:cx7="http://schemas.microsoft.com/office/drawing/2016/5/13/chartex" xmlns:cx8="http://schemas.microsoft.com/office/drawing/2016/5/14/chartex" xmlns:mc="http://schemas.openxmlformats.org/markup-compatibility/2006" xmlns:aink="http://schemas.microsoft.com/office/drawing/2016/ink" xmlns:am3d="http://schemas.microsoft.com/office/drawing/2017/model3d" xmlns:o="urn:schemas-microsoft-com:office:office" xmlns:oel="http://schemas.microsoft.com/office/2019/extlst" xmlns:r="http://schemas.openxmlformats.org/officeDocument/2006/relationships" xmlns:m="http://schemas.openxmlformats.org/officeDocument/2006/math" xmlns:v="urn:schemas-microsoft-com:vml" xmlns:wp14="http://schemas.microsoft.com/office/word/2010/wordprocessingDrawing" xmlns:wp="http://schemas.openxmlformats.org/drawingml/2006/wordprocessingDrawing" xmlns:w10="urn:schemas-microsoft-com:office:word" xmlns:w="http://schemas.openxmlformats.org/wordprocessingml/2006/main" xmlns:w14="http://schemas.microsoft.com/office/word/2010/wordml" xmlns:w15="http://schemas.microsoft.com/office/word/2012/wordml" xmlns:w16cex="http://schemas.microsoft.com/office/word/2018/wordml/cex" xmlns:w16cid="http://schemas.microsoft.com/office/word/2016/wordml/cid" xmlns:w16="http://schemas.microsoft.com/office/word/2018/wordml" xmlns:w16du="http://schemas.microsoft.com/office/word/2023/wordml/word16du" xmlns:w16sdtdh="http://schemas.microsoft.com/office/word/2020/wordml/sdtdatahash" xmlns:w16sdtfl="http://schemas.microsoft.com/office/word/2024/wordml/sdtformatlock" xmlns:w16se="http://schemas.microsoft.com/office/word/2015/wordml/symex" xmlns:wpg="http://schemas.microsoft.com/office/word/2010/wordprocessingGroup" xmlns:wpi="http://schemas.microsoft.com/office/word/2010/wordprocessingInk" xmlns:wne="http://schemas.microsoft.com/office/word/2006/wordml" xmlns:wps="http://schemas.microsoft.com/office/word/2010/wordprocessingShape" mc:Ignorable="w14 w15 w16se w16cid w16 w16cex w16sdtdh w16sdtfl w16du wp14">
+  <w:p>
+    <w:pPr>
+      <w:pStyle w:val="Footer"/>
+    </w:pPr>
+  </w:p>
+</w:ftr>
+</file>
+
+<file path=word/footer2.xml><?xml version="1.0" encoding="utf-8"?>
+<w:ftr xmlns:wpc="http://schemas.microsoft.com/office/word/2010/wordprocessingCanvas" xmlns:cx="http://schemas.microsoft.com/office/drawing/2014/chartex" xmlns:cx1="http://schemas.microsoft.com/office/drawing/2015/9/8/chartex" xmlns:cx2="http://schemas.microsoft.com/office/drawing/2015/10/21/chartex" xmlns:cx3="http://schemas.microsoft.com/office/drawing/2016/5/9/chartex" xmlns:cx4="http://schemas.microsoft.com/office/drawing/2016/5/10/chartex" xmlns:cx5="http://schemas.microsoft.com/office/drawing/2016/5/11/chartex" xmlns:cx6="http://schemas.microsoft.com/office/drawing/2016/5/12/chartex" xmlns:cx7="http://schemas.microsoft.com/office/drawing/2016/5/13/chartex" xmlns:cx8="http://schemas.microsoft.com/office/drawing/2016/5/14/chartex" xmlns:mc="http://schemas.openxmlformats.org/markup-compatibility/2006" xmlns:aink="http://schemas.microsoft.com/office/drawing/2016/ink" xmlns:am3d="http://schemas.microsoft.com/office/drawing/2017/model3d" xmlns:o="urn:schemas-microsoft-com:office:office" xmlns:oel="http://schemas.microsoft.com/office/2019/extlst" xmlns:r="http://schemas.openxmlformats.org/officeDocument/2006/relationships" xmlns:m="http://schemas.openxmlformats.org/officeDocument/2006/math" xmlns:v="urn:schemas-microsoft-com:vml" xmlns:wp14="http://schemas.microsoft.com/office/word/2010/wordprocessingDrawing" xmlns:wp="http://schemas.openxmlformats.org/drawingml/2006/wordprocessingDrawing" xmlns:w10="urn:schemas-microsoft-com:office:word" xmlns:w="http://schemas.openxmlformats.org/wordprocessingml/2006/main" xmlns:w14="http://schemas.microsoft.com/office/word/2010/wordml" xmlns:w15="http://schemas.microsoft.com/office/word/2012/wordml" xmlns:w16cex="http://schemas.microsoft.com/office/word/2018/wordml/cex" xmlns:w16cid="http://schemas.microsoft.com/office/word/2016/wordml/cid" xmlns:w16="http://schemas.microsoft.com/office/word/2018/wordml" xmlns:w16du="http://schemas.microsoft.com/office/word/2023/wordml/word16du" xmlns:w16sdtdh="http://schemas.microsoft.com/office/word/2020/wordml/sdtdatahash" xmlns:w16sdtfl="http://schemas.microsoft.com/office/word/2024/wordml/sdtformatlock" xmlns:w16se="http://schemas.microsoft.com/office/word/2015/wordml/symex" xmlns:wpg="http://schemas.microsoft.com/office/word/2010/wordprocessingGroup" xmlns:wpi="http://schemas.microsoft.com/office/word/2010/wordprocessingInk" xmlns:wne="http://schemas.microsoft.com/office/word/2006/wordml" xmlns:wps="http://schemas.microsoft.com/office/word/2010/wordprocessingShape" mc:Ignorable="w14 w15 w16se w16cid w16 w16cex w16sdtdh w16sdtfl w16du wp14">
+  <w:p>
+    <w:pPr>
+      <w:pStyle w:val="Footer"/>
+    </w:pPr>
+  </w:p>
+</w:ftr>
+</file>
+
+<file path=word/footer3.xml><?xml version="1.0" encoding="utf-8"?>
+<w:ftr xmlns:wpc="http://schemas.microsoft.com/office/word/2010/wordprocessingCanvas" xmlns:cx="http://schemas.microsoft.com/office/drawing/2014/chartex" xmlns:cx1="http://schemas.microsoft.com/office/drawing/2015/9/8/chartex" xmlns:cx2="http://schemas.microsoft.com/office/drawing/2015/10/21/chartex" xmlns:cx3="http://schemas.microsoft.com/office/drawing/2016/5/9/chartex" xmlns:cx4="http://schemas.microsoft.com/office/drawing/2016/5/10/chartex" xmlns:cx5="http://schemas.microsoft.com/office/drawing/2016/5/11/chartex" xmlns:cx6="http://schemas.microsoft.com/office/drawing/2016/5/12/chartex" xmlns:cx7="http://schemas.microsoft.com/office/drawing/2016/5/13/chartex" xmlns:cx8="http://schemas.microsoft.com/office/drawing/2016/5/14/chartex" xmlns:mc="http://schemas.openxmlformats.org/markup-compatibility/2006" xmlns:aink="http://schemas.microsoft.com/office/drawing/2016/ink" xmlns:am3d="http://schemas.microsoft.com/office/drawing/2017/model3d" xmlns:o="urn:schemas-microsoft-com:office:office" xmlns:oel="http://schemas.microsoft.com/office/2019/extlst" xmlns:r="http://schemas.openxmlformats.org/officeDocument/2006/relationships" xmlns:m="http://schemas.openxmlformats.org/officeDocument/2006/math" xmlns:v="urn:schemas-microsoft-com:vml" xmlns:wp14="http://schemas.microsoft.com/office/word/2010/wordprocessingDrawing" xmlns:wp="http://schemas.openxmlformats.org/drawingml/2006/wordprocessingDrawing" xmlns:w10="urn:schemas-microsoft-com:office:word" xmlns:w="http://schemas.openxmlformats.org/wordprocessingml/2006/main" xmlns:w14="http://schemas.microsoft.com/office/word/2010/wordml" xmlns:w15="http://schemas.microsoft.com/office/word/2012/wordml" xmlns:w16cex="http://schemas.microsoft.com/office/word/2018/wordml/cex" xmlns:w16cid="http://schemas.microsoft.com/office/word/2016/wordml/cid" xmlns:w16="http://schemas.microsoft.com/office/word/2018/wordml" xmlns:w16du="http://schemas.microsoft.com/office/word/2023/wordml/word16du" xmlns:w16sdtdh="http://schemas.microsoft.com/office/word/2020/wordml/sdtdatahash" xmlns:w16sdtfl="http://schemas.microsoft.com/office/word/2024/wordml/sdtformatlock" xmlns:w16se="http://schemas.microsoft.com/office/word/2015/wordml/symex" xmlns:wpg="http://schemas.microsoft.com/office/word/2010/wordprocessingGroup" xmlns:wpi="http://schemas.microsoft.com/office/word/2010/wordprocessingInk" xmlns:wne="http://schemas.microsoft.com/office/word/2006/wordml" xmlns:wps="http://schemas.microsoft.com/office/word/2010/wordprocessingShape" mc:Ignorable="w14 w15 w16se w16cid w16 w16cex w16sdtdh w16sdtfl w16du wp14">
+  <w:p>
+    <w:pPr>
+      <w:pStyle w:val="Footer"/>
+    </w:pPr>
+  </w:p>
+</w:ftr>
+</file>
+
 <file path=word/footnotes.xml><?xml version="1.0" encoding="utf-8"?>
 <w:footnotes xmlns:wpc="http://schemas.microsoft.com/office/word/2010/wordprocessingCanvas" xmlns:cx="http://schemas.microsoft.com/office/drawing/2014/chartex" xmlns:cx1="http://schemas.microsoft.com/office/drawing/2015/9/8/chartex" xmlns:cx2="http://schemas.microsoft.com/office/drawing/2015/10/21/chartex" xmlns:cx3="http://schemas.microsoft.com/office/drawing/2016/5/9/chartex" xmlns:cx4="http://schemas.microsoft.com/office/drawing/2016/5/10/chartex" xmlns:cx5="http://schemas.microsoft.com/office/drawing/2016/5/11/chartex" xmlns:cx6="http://schemas.microsoft.com/office/drawing/2016/5/12/chartex" xmlns:cx7="http://schemas.microsoft.com/office/drawing/2016/5/13/chartex" xmlns:cx8="http://schemas.microsoft.com/office/drawing/2016/5/14/chartex" xmlns:mc="http://schemas.openxmlformats.org/markup-compatibility/2006" xmlns:aink="http://schemas.microsoft.com/office/drawing/2016/ink" xmlns:am3d="http://schemas.microsoft.com/office/drawing/2017/model3d" xmlns:o="urn:schemas-microsoft-com:office:office" xmlns:oel="http://schemas.microsoft.com/office/2019/extlst" xmlns:r="http://schemas.openxmlformats.org/officeDocument/2006/relationships" xmlns:m="http://schemas.openxmlformats.org/officeDocument/2006/math" xmlns:v="urn:schemas-microsoft-com:vml" xmlns:wp14="http://schemas.microsoft.com/office/word/2010/wordprocessingDrawing" xmlns:wp="http://schemas.openxmlformats.org/drawingml/2006/wordprocessingDrawing" xmlns:w10="urn:schemas-microsoft-com:office:word" xmlns:w="http://schemas.openxmlformats.org/wordprocessingml/2006/main" xmlns:w14="http://schemas.microsoft.com/office/word/2010/wordml" xmlns:w15="http://schemas.microsoft.com/office/word/2012/wordml" xmlns:w16cex="http://schemas.microsoft.com/office/word/2018/wordml/cex" xmlns:w16cid="http://schemas.microsoft.com/office/word/2016/wordml/cid" xmlns:w16="http://schemas.microsoft.com/office/word/2018/wordml" xmlns:w16du="http://schemas.microsoft.com/office/word/2023/wordml/word16du" xmlns:w16sdtdh="http://schemas.microsoft.com/office/word/2020/wordml/sdtdatahash" xmlns:w16sdtfl="http://schemas.microsoft.com/office/word/2024/wordml/sdtformatlock" xmlns:w16se="http://schemas.microsoft.com/office/word/2015/wordml/symex" xmlns:wpg="http://schemas.microsoft.com/office/word/2010/wordprocessingGroup" xmlns:wpi="http://schemas.microsoft.com/office/word/2010/wordprocessingInk" xmlns:wne="http://schemas.microsoft.com/office/word/2006/wordml" xmlns:wps="http://schemas.microsoft.com/office/word/2010/wordprocessingShape" mc:Ignorable="w14 w15 w16se w16cid w16 w16cex w16sdtdh w16sdtfl w16du wp14">
   <w:footnote w:type="separator" w:id="-1">
@@ -3230,6 +5644,11 @@
       <w:pStyle w:val="Header"/>
     </w:pPr>
   </w:p>
+</w:hdr>
+</file>
+
+<file path=word/header2.xml><?xml version="1.0" encoding="utf-8"?>
+<w:hdr xmlns:wpc="http://schemas.microsoft.com/office/word/2010/wordprocessingCanvas" xmlns:cx="http://schemas.microsoft.com/office/drawing/2014/chartex" xmlns:cx1="http://schemas.microsoft.com/office/drawing/2015/9/8/chartex" xmlns:cx2="http://schemas.microsoft.com/office/drawing/2015/10/21/chartex" xmlns:cx3="http://schemas.microsoft.com/office/drawing/2016/5/9/chartex" xmlns:cx4="http://schemas.microsoft.com/office/drawing/2016/5/10/chartex" xmlns:cx5="http://schemas.microsoft.com/office/drawing/2016/5/11/chartex" xmlns:cx6="http://schemas.microsoft.com/office/drawing/2016/5/12/chartex" xmlns:cx7="http://schemas.microsoft.com/office/drawing/2016/5/13/chartex" xmlns:cx8="http://schemas.microsoft.com/office/drawing/2016/5/14/chartex" xmlns:mc="http://schemas.openxmlformats.org/markup-compatibility/2006" xmlns:aink="http://schemas.microsoft.com/office/drawing/2016/ink" xmlns:am3d="http://schemas.microsoft.com/office/drawing/2017/model3d" xmlns:o="urn:schemas-microsoft-com:office:office" xmlns:oel="http://schemas.microsoft.com/office/2019/extlst" xmlns:r="http://schemas.openxmlformats.org/officeDocument/2006/relationships" xmlns:m="http://schemas.openxmlformats.org/officeDocument/2006/math" xmlns:v="urn:schemas-microsoft-com:vml" xmlns:wp14="http://schemas.microsoft.com/office/word/2010/wordprocessingDrawing" xmlns:wp="http://schemas.openxmlformats.org/drawingml/2006/wordprocessingDrawing" xmlns:w10="urn:schemas-microsoft-com:office:word" xmlns:w="http://schemas.openxmlformats.org/wordprocessingml/2006/main" xmlns:w14="http://schemas.microsoft.com/office/word/2010/wordml" xmlns:w15="http://schemas.microsoft.com/office/word/2012/wordml" xmlns:w16cex="http://schemas.microsoft.com/office/word/2018/wordml/cex" xmlns:w16cid="http://schemas.microsoft.com/office/word/2016/wordml/cid" xmlns:w16="http://schemas.microsoft.com/office/word/2018/wordml" xmlns:w16du="http://schemas.microsoft.com/office/word/2023/wordml/word16du" xmlns:w16sdtdh="http://schemas.microsoft.com/office/word/2020/wordml/sdtdatahash" xmlns:w16sdtfl="http://schemas.microsoft.com/office/word/2024/wordml/sdtformatlock" xmlns:w16se="http://schemas.microsoft.com/office/word/2015/wordml/symex" xmlns:wpg="http://schemas.microsoft.com/office/word/2010/wordprocessingGroup" xmlns:wpi="http://schemas.microsoft.com/office/word/2010/wordprocessingInk" xmlns:wne="http://schemas.microsoft.com/office/word/2006/wordml" xmlns:wps="http://schemas.microsoft.com/office/word/2010/wordprocessingShape" mc:Ignorable="w14 w15 w16se w16cid w16 w16cex w16sdtdh w16sdtfl w16du wp14">
   <w:p>
     <w:pPr>
       <w:pStyle w:val="Header"/>
@@ -3249,18 +5668,77 @@
     <w:pPr>
       <w:pStyle w:val="Header"/>
     </w:pPr>
+  </w:p>
+  <w:p>
+    <w:pPr>
+      <w:pStyle w:val="Header"/>
+      <w:rPr>
+        <w:b/>
+        <w:bCs/>
+      </w:rPr>
+    </w:pPr>
     <w:r>
+      <w:rPr>
+        <w:b/>
+        <w:bCs/>
+      </w:rPr>
       <w:t xml:space="preserve"> API Endpoint table</w:t>
     </w:r>
   </w:p>
   <w:p>
     <w:pPr>
       <w:pStyle w:val="Header"/>
+      <w:rPr>
+        <w:b/>
+        <w:bCs/>
+      </w:rPr>
     </w:pPr>
     <w:r>
-      <w:t>Table 1: Organiser Endpoint</w:t>
+      <w:rPr>
+        <w:b/>
+        <w:bCs/>
+      </w:rPr>
+      <w:t xml:space="preserve">Table </w:t>
+    </w:r>
+    <w:r>
+      <w:rPr>
+        <w:b/>
+        <w:bCs/>
+      </w:rPr>
+      <w:t>2</w:t>
+    </w:r>
+    <w:r>
+      <w:rPr>
+        <w:b/>
+        <w:bCs/>
+      </w:rPr>
+      <w:t xml:space="preserve">: </w:t>
+    </w:r>
+    <w:r>
+      <w:rPr>
+        <w:b/>
+        <w:bCs/>
+      </w:rPr>
+      <w:t>Participants</w:t>
+    </w:r>
+    <w:r>
+      <w:rPr>
+        <w:b/>
+        <w:bCs/>
+      </w:rPr>
+      <w:t xml:space="preserve"> Endpoint</w:t>
     </w:r>
   </w:p>
+  <w:p>
+    <w:pPr>
+      <w:pStyle w:val="Header"/>
+    </w:pPr>
+  </w:p>
+</w:hdr>
+</file>
+
+<file path=word/header3.xml><?xml version="1.0" encoding="utf-8"?>
+<w:hdr xmlns:wpc="http://schemas.microsoft.com/office/word/2010/wordprocessingCanvas" xmlns:cx="http://schemas.microsoft.com/office/drawing/2014/chartex" xmlns:cx1="http://schemas.microsoft.com/office/drawing/2015/9/8/chartex" xmlns:cx2="http://schemas.microsoft.com/office/drawing/2015/10/21/chartex" xmlns:cx3="http://schemas.microsoft.com/office/drawing/2016/5/9/chartex" xmlns:cx4="http://schemas.microsoft.com/office/drawing/2016/5/10/chartex" xmlns:cx5="http://schemas.microsoft.com/office/drawing/2016/5/11/chartex" xmlns:cx6="http://schemas.microsoft.com/office/drawing/2016/5/12/chartex" xmlns:cx7="http://schemas.microsoft.com/office/drawing/2016/5/13/chartex" xmlns:cx8="http://schemas.microsoft.com/office/drawing/2016/5/14/chartex" xmlns:mc="http://schemas.openxmlformats.org/markup-compatibility/2006" xmlns:aink="http://schemas.microsoft.com/office/drawing/2016/ink" xmlns:am3d="http://schemas.microsoft.com/office/drawing/2017/model3d" xmlns:o="urn:schemas-microsoft-com:office:office" xmlns:oel="http://schemas.microsoft.com/office/2019/extlst" xmlns:r="http://schemas.openxmlformats.org/officeDocument/2006/relationships" xmlns:m="http://schemas.openxmlformats.org/officeDocument/2006/math" xmlns:v="urn:schemas-microsoft-com:vml" xmlns:wp14="http://schemas.microsoft.com/office/word/2010/wordprocessingDrawing" xmlns:wp="http://schemas.openxmlformats.org/drawingml/2006/wordprocessingDrawing" xmlns:w10="urn:schemas-microsoft-com:office:word" xmlns:w="http://schemas.openxmlformats.org/wordprocessingml/2006/main" xmlns:w14="http://schemas.microsoft.com/office/word/2010/wordml" xmlns:w15="http://schemas.microsoft.com/office/word/2012/wordml" xmlns:w16cex="http://schemas.microsoft.com/office/word/2018/wordml/cex" xmlns:w16cid="http://schemas.microsoft.com/office/word/2016/wordml/cid" xmlns:w16="http://schemas.microsoft.com/office/word/2018/wordml" xmlns:w16du="http://schemas.microsoft.com/office/word/2023/wordml/word16du" xmlns:w16sdtdh="http://schemas.microsoft.com/office/word/2020/wordml/sdtdatahash" xmlns:w16sdtfl="http://schemas.microsoft.com/office/word/2024/wordml/sdtformatlock" xmlns:w16se="http://schemas.microsoft.com/office/word/2015/wordml/symex" xmlns:wpg="http://schemas.microsoft.com/office/word/2010/wordprocessingGroup" xmlns:wpi="http://schemas.microsoft.com/office/word/2010/wordprocessingInk" xmlns:wne="http://schemas.microsoft.com/office/word/2006/wordml" xmlns:wps="http://schemas.microsoft.com/office/word/2010/wordprocessingShape" mc:Ignorable="w14 w15 w16se w16cid w16 w16cex w16sdtdh w16sdtfl w16du wp14">
   <w:p>
     <w:pPr>
       <w:pStyle w:val="Header"/>
@@ -4533,6 +7011,125 @@
       </w:tcPr>
     </w:tblStylePr>
   </w:style>
+  <w:style w:type="character" w:styleId="HTMLCode">
+    <w:name w:val="HTML Code"/>
+    <w:basedOn w:val="DefaultParagraphFont"/>
+    <w:uiPriority w:val="99"/>
+    <w:semiHidden/>
+    <w:unhideWhenUsed/>
+    <w:rsid w:val="00453FE7"/>
+    <w:rPr>
+      <w:rFonts w:ascii="Courier New" w:eastAsia="Times New Roman" w:hAnsi="Courier New" w:cs="Courier New"/>
+      <w:sz w:val="20"/>
+      <w:szCs w:val="20"/>
+    </w:rPr>
+  </w:style>
+  <w:style w:type="table" w:styleId="GridTable5Dark-Accent5">
+    <w:name w:val="Grid Table 5 Dark Accent 5"/>
+    <w:basedOn w:val="TableNormal"/>
+    <w:uiPriority w:val="50"/>
+    <w:rsid w:val="002155EB"/>
+    <w:pPr>
+      <w:spacing w:after="0" w:line="240" w:lineRule="auto"/>
+    </w:pPr>
+    <w:tblPr>
+      <w:tblStyleRowBandSize w:val="1"/>
+      <w:tblStyleColBandSize w:val="1"/>
+      <w:tblBorders>
+        <w:top w:val="single" w:sz="4" w:space="0" w:color="FFFFFF" w:themeColor="background1"/>
+        <w:left w:val="single" w:sz="4" w:space="0" w:color="FFFFFF" w:themeColor="background1"/>
+        <w:bottom w:val="single" w:sz="4" w:space="0" w:color="FFFFFF" w:themeColor="background1"/>
+        <w:right w:val="single" w:sz="4" w:space="0" w:color="FFFFFF" w:themeColor="background1"/>
+        <w:insideH w:val="single" w:sz="4" w:space="0" w:color="FFFFFF" w:themeColor="background1"/>
+        <w:insideV w:val="single" w:sz="4" w:space="0" w:color="FFFFFF" w:themeColor="background1"/>
+      </w:tblBorders>
+    </w:tblPr>
+    <w:tcPr>
+      <w:shd w:val="clear" w:color="auto" w:fill="F2CEED" w:themeFill="accent5" w:themeFillTint="33"/>
+    </w:tcPr>
+    <w:tblStylePr w:type="firstRow">
+      <w:rPr>
+        <w:b/>
+        <w:bCs/>
+        <w:color w:val="FFFFFF" w:themeColor="background1"/>
+      </w:rPr>
+      <w:tblPr/>
+      <w:tcPr>
+        <w:tcBorders>
+          <w:top w:val="single" w:sz="4" w:space="0" w:color="FFFFFF" w:themeColor="background1"/>
+          <w:left w:val="single" w:sz="4" w:space="0" w:color="FFFFFF" w:themeColor="background1"/>
+          <w:right w:val="single" w:sz="4" w:space="0" w:color="FFFFFF" w:themeColor="background1"/>
+          <w:insideH w:val="nil"/>
+          <w:insideV w:val="nil"/>
+        </w:tcBorders>
+        <w:shd w:val="clear" w:color="auto" w:fill="A02B93" w:themeFill="accent5"/>
+      </w:tcPr>
+    </w:tblStylePr>
+    <w:tblStylePr w:type="lastRow">
+      <w:rPr>
+        <w:b/>
+        <w:bCs/>
+        <w:color w:val="FFFFFF" w:themeColor="background1"/>
+      </w:rPr>
+      <w:tblPr/>
+      <w:tcPr>
+        <w:tcBorders>
+          <w:left w:val="single" w:sz="4" w:space="0" w:color="FFFFFF" w:themeColor="background1"/>
+          <w:bottom w:val="single" w:sz="4" w:space="0" w:color="FFFFFF" w:themeColor="background1"/>
+          <w:right w:val="single" w:sz="4" w:space="0" w:color="FFFFFF" w:themeColor="background1"/>
+          <w:insideH w:val="nil"/>
+          <w:insideV w:val="nil"/>
+        </w:tcBorders>
+        <w:shd w:val="clear" w:color="auto" w:fill="A02B93" w:themeFill="accent5"/>
+      </w:tcPr>
+    </w:tblStylePr>
+    <w:tblStylePr w:type="firstCol">
+      <w:rPr>
+        <w:b/>
+        <w:bCs/>
+        <w:color w:val="FFFFFF" w:themeColor="background1"/>
+      </w:rPr>
+      <w:tblPr/>
+      <w:tcPr>
+        <w:tcBorders>
+          <w:top w:val="single" w:sz="4" w:space="0" w:color="FFFFFF" w:themeColor="background1"/>
+          <w:left w:val="single" w:sz="4" w:space="0" w:color="FFFFFF" w:themeColor="background1"/>
+          <w:bottom w:val="single" w:sz="4" w:space="0" w:color="FFFFFF" w:themeColor="background1"/>
+          <w:insideV w:val="nil"/>
+        </w:tcBorders>
+        <w:shd w:val="clear" w:color="auto" w:fill="A02B93" w:themeFill="accent5"/>
+      </w:tcPr>
+    </w:tblStylePr>
+    <w:tblStylePr w:type="lastCol">
+      <w:rPr>
+        <w:b/>
+        <w:bCs/>
+        <w:color w:val="FFFFFF" w:themeColor="background1"/>
+      </w:rPr>
+      <w:tblPr/>
+      <w:tcPr>
+        <w:tcBorders>
+          <w:top w:val="single" w:sz="4" w:space="0" w:color="FFFFFF" w:themeColor="background1"/>
+          <w:bottom w:val="single" w:sz="4" w:space="0" w:color="FFFFFF" w:themeColor="background1"/>
+          <w:right w:val="single" w:sz="4" w:space="0" w:color="FFFFFF" w:themeColor="background1"/>
+          <w:insideV w:val="nil"/>
+        </w:tcBorders>
+        <w:shd w:val="clear" w:color="auto" w:fill="A02B93" w:themeFill="accent5"/>
+      </w:tcPr>
+    </w:tblStylePr>
+    <w:tblStylePr w:type="band1Vert">
+      <w:tblPr/>
+      <w:tcPr>
+        <w:shd w:val="clear" w:color="auto" w:fill="E59EDC" w:themeFill="accent5" w:themeFillTint="66"/>
+      </w:tcPr>
+    </w:tblStylePr>
+    <w:tblStylePr w:type="band1Horz">
+      <w:tblPr/>
+      <w:tcPr>
+        <w:shd w:val="clear" w:color="auto" w:fill="E59EDC" w:themeFill="accent5" w:themeFillTint="66"/>
+      </w:tcPr>
+    </w:tblStylePr>
+  </w:style>
 </w:styles>
 </file>
 

</xml_diff>